<commit_message>
add pooled (clean+noisy together) result to report
</commit_message>
<xml_diff>
--- a/REPORT.docx
+++ b/REPORT.docx
@@ -597,6 +597,235 @@
         <w:pStyle w:val="Heading1"/>
       </w:pPr>
       <w:r>
+        <w:t>Supplementary: pooling clean and noisy</w:t>
+      </w:r>
+    </w:p>
+    <w:p>
+      <w:pPr>
+        <w:spacing w:after="160"/>
+      </w:pPr>
+      <w:r>
+        <w:rPr>
+          <w:b w:val="0"/>
+          <w:i w:val="0"/>
+        </w:rPr>
+        <w:t>I kept clean and noisy separate as you advised. To see what that costs, I also ran the same model on all 43 recordings together, still holding out whole recordings so there is no leakage:</w:t>
+      </w:r>
+    </w:p>
+    <w:tbl>
+      <w:tblPr>
+        <w:tblStyle w:val="LightGrid-Accent1"/>
+        <w:tblW w:type="auto" w:w="0"/>
+        <w:tblLook w:firstColumn="1" w:firstRow="1" w:lastColumn="0" w:lastRow="0" w:noHBand="0" w:noVBand="1" w:val="04A0"/>
+      </w:tblPr>
+      <w:tblGrid>
+        <w:gridCol w:w="2880"/>
+        <w:gridCol w:w="2880"/>
+        <w:gridCol w:w="2880"/>
+      </w:tblGrid>
+      <w:tr>
+        <w:tc>
+          <w:tcPr>
+            <w:tcW w:type="dxa" w:w="2880"/>
+          </w:tcPr>
+          <w:p>
+            <w:r/>
+            <w:r>
+              <w:rPr>
+                <w:b/>
+              </w:rPr>
+            </w:r>
+          </w:p>
+        </w:tc>
+        <w:tc>
+          <w:tcPr>
+            <w:tcW w:type="dxa" w:w="2880"/>
+          </w:tcPr>
+          <w:p>
+            <w:r/>
+            <w:r>
+              <w:rPr>
+                <w:b/>
+              </w:rPr>
+              <w:t>Separate</w:t>
+            </w:r>
+          </w:p>
+        </w:tc>
+        <w:tc>
+          <w:tcPr>
+            <w:tcW w:type="dxa" w:w="2880"/>
+          </w:tcPr>
+          <w:p>
+            <w:r/>
+            <w:r>
+              <w:rPr>
+                <w:b/>
+              </w:rPr>
+              <w:t>Pooled</w:t>
+            </w:r>
+          </w:p>
+        </w:tc>
+      </w:tr>
+      <w:tr>
+        <w:tc>
+          <w:tcPr>
+            <w:tcW w:type="dxa" w:w="2880"/>
+          </w:tcPr>
+          <w:p>
+            <w:r/>
+            <w:r>
+              <w:t>6 apertures</w:t>
+            </w:r>
+          </w:p>
+        </w:tc>
+        <w:tc>
+          <w:tcPr>
+            <w:tcW w:type="dxa" w:w="2880"/>
+          </w:tcPr>
+          <w:p>
+            <w:pPr>
+              <w:jc w:val="center"/>
+            </w:pPr>
+            <w:r/>
+            <w:r>
+              <w:t>0.74 (32/43)</w:t>
+            </w:r>
+          </w:p>
+        </w:tc>
+        <w:tc>
+          <w:tcPr>
+            <w:tcW w:type="dxa" w:w="2880"/>
+          </w:tcPr>
+          <w:p>
+            <w:pPr>
+              <w:jc w:val="center"/>
+            </w:pPr>
+            <w:r/>
+            <w:r>
+              <w:rPr>
+                <w:b/>
+              </w:rPr>
+              <w:t>0.84 (36/43)</w:t>
+            </w:r>
+          </w:p>
+        </w:tc>
+      </w:tr>
+      <w:tr>
+        <w:tc>
+          <w:tcPr>
+            <w:tcW w:type="dxa" w:w="2880"/>
+          </w:tcPr>
+          <w:p>
+            <w:r/>
+            <w:r>
+              <w:t>3 levels</w:t>
+            </w:r>
+          </w:p>
+        </w:tc>
+        <w:tc>
+          <w:tcPr>
+            <w:tcW w:type="dxa" w:w="2880"/>
+          </w:tcPr>
+          <w:p>
+            <w:pPr>
+              <w:jc w:val="center"/>
+            </w:pPr>
+            <w:r/>
+            <w:r>
+              <w:t>0.95 (41/43)</w:t>
+            </w:r>
+          </w:p>
+        </w:tc>
+        <w:tc>
+          <w:tcPr>
+            <w:tcW w:type="dxa" w:w="2880"/>
+          </w:tcPr>
+          <w:p>
+            <w:pPr>
+              <w:jc w:val="center"/>
+            </w:pPr>
+            <w:r/>
+            <w:r>
+              <w:rPr>
+                <w:b/>
+              </w:rPr>
+              <w:t>1.00 (43/43)</w:t>
+            </w:r>
+          </w:p>
+        </w:tc>
+      </w:tr>
+      <w:tr>
+        <w:tc>
+          <w:tcPr>
+            <w:tcW w:type="dxa" w:w="2880"/>
+          </w:tcPr>
+          <w:p>
+            <w:r/>
+            <w:r>
+              <w:t>Cavitation vs. no cavitation</w:t>
+            </w:r>
+          </w:p>
+        </w:tc>
+        <w:tc>
+          <w:tcPr>
+            <w:tcW w:type="dxa" w:w="2880"/>
+          </w:tcPr>
+          <w:p>
+            <w:pPr>
+              <w:jc w:val="center"/>
+            </w:pPr>
+            <w:r/>
+            <w:r>
+              <w:t>1.00</w:t>
+            </w:r>
+          </w:p>
+        </w:tc>
+        <w:tc>
+          <w:tcPr>
+            <w:tcW w:type="dxa" w:w="2880"/>
+          </w:tcPr>
+          <w:p>
+            <w:pPr>
+              <w:jc w:val="center"/>
+            </w:pPr>
+            <w:r/>
+            <w:r>
+              <w:t>1.00</w:t>
+            </w:r>
+          </w:p>
+        </w:tc>
+      </w:tr>
+    </w:tbl>
+    <w:p/>
+    <w:p>
+      <w:pPr>
+        <w:spacing w:after="160"/>
+      </w:pPr>
+      <w:r>
+        <w:rPr>
+          <w:b w:val="0"/>
+          <w:i w:val="0"/>
+        </w:rPr>
+        <w:t>The gain comes mainly from the classes with few recordings: 20% and 15% improve from 3/8 to 5/8 correct, because pooling gives each of them 4 recordings instead of 2.</w:t>
+      </w:r>
+    </w:p>
+    <w:p>
+      <w:pPr>
+        <w:spacing w:after="160"/>
+      </w:pPr>
+      <w:r>
+        <w:rPr>
+          <w:b w:val="0"/>
+          <w:i w:val="0"/>
+        </w:rPr>
+        <w:t>The two are not exactly comparable: the pooled run used 4 folds (training on about 32 recordings) while the separate runs held out one recording at a time (training on 22 and 19), so part of the gain is simply more training data.</w:t>
+      </w:r>
+    </w:p>
+    <w:p>
+      <w:pPr>
+        <w:pStyle w:val="Heading1"/>
+      </w:pPr>
+      <w:r>
         <w:t>Limitations</w:t>
       </w:r>
     </w:p>
@@ -654,26 +883,6 @@
       </w:pPr>
       <w:r>
         <w:t>Two-stage classification (first the level, then the aperture within it) and self-supervised pretraining.</w:t>
-      </w:r>
-    </w:p>
-    <w:p>
-      <w:pPr>
-        <w:pStyle w:val="Heading1"/>
-      </w:pPr>
-      <w:r>
-        <w:t>Question</w:t>
-      </w:r>
-    </w:p>
-    <w:p>
-      <w:pPr>
-        <w:spacing w:after="160"/>
-      </w:pPr>
-      <w:r>
-        <w:rPr>
-          <w:b w:val="0"/>
-          <w:i w:val="0"/>
-        </w:rPr>
-        <w:t>Would you prefer the main reported result to use the new-recording protocol, or the shuffled-window one so it is directly comparable with the existing results?</w:t>
       </w:r>
     </w:p>
     <w:sectPr>

</xml_diff>

<commit_message>
add regression results to report
</commit_message>
<xml_diff>
--- a/REPORT.docx
+++ b/REPORT.docx
@@ -826,6 +826,247 @@
         <w:pStyle w:val="Heading1"/>
       </w:pPr>
       <w:r>
+        <w:t>Supplementary: predicting the aperture as a number</w:t>
+      </w:r>
+    </w:p>
+    <w:p>
+      <w:pPr>
+        <w:spacing w:after="160"/>
+      </w:pPr>
+      <w:r>
+        <w:rPr>
+          <w:b w:val="0"/>
+          <w:i w:val="0"/>
+        </w:rPr>
+        <w:t>Following your suggestion I also tried predicting the aperture as a continuous value rather than choosing one of 6 classes. Being a few points off then counts as a small error instead of a wrong class, which suits the settings that sit close together.</w:t>
+      </w:r>
+    </w:p>
+    <w:p>
+      <w:pPr>
+        <w:spacing w:after="160"/>
+      </w:pPr>
+      <w:r>
+        <w:rPr>
+          <w:b w:val="0"/>
+          <w:i w:val="0"/>
+        </w:rPr>
+        <w:t>Run on the pooled recordings with 4 folds:</w:t>
+      </w:r>
+    </w:p>
+    <w:tbl>
+      <w:tblPr>
+        <w:tblStyle w:val="LightGrid-Accent1"/>
+        <w:tblW w:type="auto" w:w="0"/>
+        <w:tblLook w:firstColumn="1" w:firstRow="1" w:lastColumn="0" w:lastRow="0" w:noHBand="0" w:noVBand="1" w:val="04A0"/>
+      </w:tblPr>
+      <w:tblGrid>
+        <w:gridCol w:w="2880"/>
+        <w:gridCol w:w="2880"/>
+        <w:gridCol w:w="2880"/>
+      </w:tblGrid>
+      <w:tr>
+        <w:tc>
+          <w:tcPr>
+            <w:tcW w:type="dxa" w:w="2880"/>
+          </w:tcPr>
+          <w:p>
+            <w:r/>
+            <w:r>
+              <w:rPr>
+                <w:b/>
+              </w:rPr>
+            </w:r>
+          </w:p>
+        </w:tc>
+        <w:tc>
+          <w:tcPr>
+            <w:tcW w:type="dxa" w:w="2880"/>
+          </w:tcPr>
+          <w:p>
+            <w:r/>
+            <w:r>
+              <w:rPr>
+                <w:b/>
+              </w:rPr>
+              <w:t>As 6 classes</w:t>
+            </w:r>
+          </w:p>
+        </w:tc>
+        <w:tc>
+          <w:tcPr>
+            <w:tcW w:type="dxa" w:w="2880"/>
+          </w:tcPr>
+          <w:p>
+            <w:r/>
+            <w:r>
+              <w:rPr>
+                <w:b/>
+              </w:rPr>
+              <w:t>As a number</w:t>
+            </w:r>
+          </w:p>
+        </w:tc>
+      </w:tr>
+      <w:tr>
+        <w:tc>
+          <w:tcPr>
+            <w:tcW w:type="dxa" w:w="2880"/>
+          </w:tcPr>
+          <w:p>
+            <w:r/>
+            <w:r>
+              <w:t>6 apertures</w:t>
+            </w:r>
+          </w:p>
+        </w:tc>
+        <w:tc>
+          <w:tcPr>
+            <w:tcW w:type="dxa" w:w="2880"/>
+          </w:tcPr>
+          <w:p>
+            <w:pPr>
+              <w:jc w:val="center"/>
+            </w:pPr>
+            <w:r/>
+            <w:r>
+              <w:rPr>
+                <w:b/>
+              </w:rPr>
+              <w:t>0.84 (36/43)</w:t>
+            </w:r>
+          </w:p>
+        </w:tc>
+        <w:tc>
+          <w:tcPr>
+            <w:tcW w:type="dxa" w:w="2880"/>
+          </w:tcPr>
+          <w:p>
+            <w:pPr>
+              <w:jc w:val="center"/>
+            </w:pPr>
+            <w:r/>
+            <w:r>
+              <w:t>0.79 (34/43)</w:t>
+            </w:r>
+          </w:p>
+        </w:tc>
+      </w:tr>
+      <w:tr>
+        <w:tc>
+          <w:tcPr>
+            <w:tcW w:type="dxa" w:w="2880"/>
+          </w:tcPr>
+          <w:p>
+            <w:r/>
+            <w:r>
+              <w:t>Cavitation vs. no cavitation</w:t>
+            </w:r>
+          </w:p>
+        </w:tc>
+        <w:tc>
+          <w:tcPr>
+            <w:tcW w:type="dxa" w:w="2880"/>
+          </w:tcPr>
+          <w:p>
+            <w:pPr>
+              <w:jc w:val="center"/>
+            </w:pPr>
+            <w:r/>
+            <w:r>
+              <w:t>1.00</w:t>
+            </w:r>
+          </w:p>
+        </w:tc>
+        <w:tc>
+          <w:tcPr>
+            <w:tcW w:type="dxa" w:w="2880"/>
+          </w:tcPr>
+          <w:p>
+            <w:pPr>
+              <w:jc w:val="center"/>
+            </w:pPr>
+            <w:r/>
+            <w:r>
+              <w:t>1.00 (no window wrong)</w:t>
+            </w:r>
+          </w:p>
+        </w:tc>
+      </w:tr>
+      <w:tr>
+        <w:tc>
+          <w:tcPr>
+            <w:tcW w:type="dxa" w:w="2880"/>
+          </w:tcPr>
+          <w:p>
+            <w:r/>
+            <w:r>
+              <w:t>Average error</w:t>
+            </w:r>
+          </w:p>
+        </w:tc>
+        <w:tc>
+          <w:tcPr>
+            <w:tcW w:type="dxa" w:w="2880"/>
+          </w:tcPr>
+          <w:p>
+            <w:pPr>
+              <w:jc w:val="center"/>
+            </w:pPr>
+            <w:r/>
+            <w:r>
+              <w:t>-</w:t>
+            </w:r>
+          </w:p>
+        </w:tc>
+        <w:tc>
+          <w:tcPr>
+            <w:tcW w:type="dxa" w:w="2880"/>
+          </w:tcPr>
+          <w:p>
+            <w:pPr>
+              <w:jc w:val="center"/>
+            </w:pPr>
+            <w:r/>
+            <w:r>
+              <w:rPr>
+                <w:b/>
+              </w:rPr>
+              <w:t>3.8 aperture points</w:t>
+            </w:r>
+          </w:p>
+        </w:tc>
+      </w:tr>
+    </w:tbl>
+    <w:p/>
+    <w:p>
+      <w:pPr>
+        <w:spacing w:after="160"/>
+      </w:pPr>
+      <w:r>
+        <w:rPr>
+          <w:b w:val="0"/>
+          <w:i w:val="0"/>
+        </w:rPr>
+        <w:t>The model predicts the valve opening to within 3.8 points on average, and 33 of the 43 recordings fall within 5 points.</w:t>
+      </w:r>
+    </w:p>
+    <w:p>
+      <w:pPr>
+        <w:spacing w:after="160"/>
+      </w:pPr>
+      <w:r>
+        <w:rPr>
+          <w:b w:val="0"/>
+          <w:i w:val="0"/>
+        </w:rPr>
+        <w:t>It fixed the 20% setting completely (4/4 against 3/4), but lost ground at nominal and 75%: for fully open recordings it predicts around 82 to 88 instead of 100, so those snap down to 75. Predictions are pulled towards the middle of the range, which costs accuracy at the ends. The two views are therefore complementary, and the average error is the more informative number of the two.</w:t>
+      </w:r>
+    </w:p>
+    <w:p>
+      <w:pPr>
+        <w:pStyle w:val="Heading1"/>
+      </w:pPr>
+      <w:r>
         <w:t>Limitations</w:t>
       </w:r>
     </w:p>

</xml_diff>

<commit_message>
full report with all models and experiments
</commit_message>
<xml_diff>
--- a/REPORT.docx
+++ b/REPORT.docx
@@ -7,7 +7,7 @@
         <w:pStyle w:val="Title"/>
       </w:pPr>
       <w:r>
-        <w:t>Cavitation detection from sound and vibration</w:t>
+        <w:t>Cavitation monitoring of a centrifugal pump from sound and vibration</w:t>
       </w:r>
     </w:p>
     <w:p>
@@ -16,7 +16,7 @@
           <w:i/>
           <w:color w:val="555555"/>
         </w:rPr>
-        <w:t>Progress report</w:t>
+        <w:t>Full report of the work: pipeline, models, experiments and results.</w:t>
       </w:r>
     </w:p>
     <w:p>
@@ -24,19 +24,31 @@
         <w:pStyle w:val="Heading1"/>
       </w:pPr>
       <w:r>
-        <w:t>Summary</w:t>
+        <w:t>1. Goal</w:t>
       </w:r>
     </w:p>
     <w:p>
       <w:pPr>
-        <w:spacing w:after="160"/>
+        <w:spacing w:after="140"/>
       </w:pPr>
       <w:r>
         <w:rPr>
           <w:b w:val="0"/>
           <w:i w:val="0"/>
         </w:rPr>
-        <w:t>I built a model that predicts the pump's valve aperture from the microphone and accelerometer signals, and evaluated it in two different ways. The main finding is that the evaluation method changes the result far more than the model does: when 1-second windows are shuffled and split, every model reaches close to 100%; when whole recordings are held out for testing, the honest accuracy is 0.70 to 0.80 across the 6 apertures, while cavitation vs. no cavitation is still detected perfectly.</w:t>
+        <w:t>Predict the state of the pump from a microphone and an accelerometer. An inlet valve is closed in steps, and the task is to recognise the setting from a short slice of the two signals: nominal, 75%, 50%, 25%, 20%, 15%.</w:t>
+      </w:r>
+    </w:p>
+    <w:p>
+      <w:pPr>
+        <w:spacing w:after="140"/>
+      </w:pPr>
+      <w:r>
+        <w:rPr>
+          <w:b w:val="0"/>
+          <w:i w:val="0"/>
+        </w:rPr>
+        <w:t>Cavitation is never fully developed for safety reasons and begins around the 25% setting, so the six settings really cover three physical states: no cavitation (nominal, 75%, 50%), onset (25%) and developing cavitation (20%, 15%).</w:t>
       </w:r>
     </w:p>
     <w:p>
@@ -44,139 +56,7 @@
         <w:pStyle w:val="Heading1"/>
       </w:pPr>
       <w:r>
-        <w:t>Setup</w:t>
-      </w:r>
-    </w:p>
-    <w:p>
-      <w:pPr>
-        <w:pStyle w:val="ListBullet"/>
-      </w:pPr>
-      <w:r>
-        <w:t>Clean and noisy signals kept as two separate datasets, as you advised.</w:t>
-      </w:r>
-    </w:p>
-    <w:p>
-      <w:pPr>
-        <w:pStyle w:val="ListBullet"/>
-      </w:pPr>
-      <w:r>
-        <w:t>Target: the 6 valve apertures (nominal, 75%, 50%, 25%, 20%, 15%).</w:t>
-      </w:r>
-    </w:p>
-    <w:p>
-      <w:pPr>
-        <w:pStyle w:val="ListBullet"/>
-      </w:pPr>
-      <w:r>
-        <w:t>Signals cut into 1-second windows: microphone (2 channels, 48 kHz) and accelerometer (3 axes, 4 kHz).</w:t>
-      </w:r>
-    </w:p>
-    <w:p>
-      <w:pPr>
-        <w:pStyle w:val="ListBullet"/>
-      </w:pPr>
-      <w:r>
-        <w:t>23 clean recordings, 20 noisy. One recording (20260401_133648) was excluded because its accelerometer file is empty.</w:t>
-      </w:r>
-    </w:p>
-    <w:p>
-      <w:pPr>
-        <w:pStyle w:val="Heading1"/>
-      </w:pPr>
-      <w:r>
-        <w:t>Evaluation</w:t>
-      </w:r>
-    </w:p>
-    <w:p>
-      <w:pPr>
-        <w:spacing w:after="160"/>
-      </w:pPr>
-      <w:r>
-        <w:rPr>
-          <w:b w:val="0"/>
-          <w:i w:val="0"/>
-        </w:rPr>
-        <w:t>Two protocols were compared:</w:t>
-      </w:r>
-    </w:p>
-    <w:p>
-      <w:pPr>
-        <w:pStyle w:val="ListNumber"/>
-      </w:pPr>
-      <w:r>
-        <w:t>Shuffled windows (70/15/15). All windows are pooled and split at random. Windows from the same recording end up in both training and test, so the scores are optimistic.</w:t>
-      </w:r>
-    </w:p>
-    <w:p>
-      <w:pPr>
-        <w:pStyle w:val="ListNumber"/>
-      </w:pPr>
-      <w:r>
-        <w:t>New recordings (leave one recording out). One whole recording is held out, the model trains on all the others, and this repeats until every recording has been the test recording once. Training and test never share a recording.</w:t>
-      </w:r>
-    </w:p>
-    <w:p>
-      <w:pPr>
-        <w:spacing w:after="160"/>
-      </w:pPr>
-      <w:r>
-        <w:rPr>
-          <w:b w:val="0"/>
-          <w:i w:val="0"/>
-        </w:rPr>
-        <w:t>Since each recording is a single operating point, the second protocol measures whether the model generalises to a recording it has never seen.</w:t>
-      </w:r>
-    </w:p>
-    <w:p>
-      <w:pPr>
-        <w:pStyle w:val="Heading1"/>
-      </w:pPr>
-      <w:r>
-        <w:t>Model</w:t>
-      </w:r>
-    </w:p>
-    <w:p>
-      <w:pPr>
-        <w:spacing w:after="160"/>
-      </w:pPr>
-      <w:r>
-        <w:rPr>
-          <w:b w:val="0"/>
-          <w:i w:val="0"/>
-        </w:rPr>
-        <w:t>An early-fusion network. The microphone and accelerometer signals are converted to spectrograms, resized to a common grid, stacked together as channels of a single image, and processed by one small CNN (about 115k parameters). The two signals are therefore combined at the input rather than in separate branches.</w:t>
-      </w:r>
-    </w:p>
-    <w:p>
-      <w:pPr>
-        <w:spacing w:after="160"/>
-      </w:pPr>
-      <w:r>
-        <w:rPr>
-          <w:b w:val="0"/>
-          <w:i w:val="0"/>
-        </w:rPr>
-        <w:t>Training: AdamW, learning rate 1e-3, weight decay 1e-4, cosine schedule, batch size 32, 20 epochs, class weighting, fixed random seed so results are reproducible.</w:t>
-      </w:r>
-    </w:p>
-    <w:p>
-      <w:pPr>
-        <w:pStyle w:val="Heading1"/>
-      </w:pPr>
-      <w:r>
-        <w:t>Results</w:t>
-      </w:r>
-    </w:p>
-    <w:p>
-      <w:pPr>
-        <w:spacing w:after="80"/>
-      </w:pPr>
-      <w:r>
-        <w:rPr>
-          <w:b/>
-          <w:i w:val="0"/>
-        </w:rPr>
-        <w:t>Shuffled windows (clean):</w:t>
+        <w:t>2. Data</w:t>
       </w:r>
     </w:p>
     <w:tbl>
@@ -200,7 +80,6 @@
               <w:rPr>
                 <w:b/>
               </w:rPr>
-              <w:t>Model</w:t>
             </w:r>
           </w:p>
         </w:tc>
@@ -214,88 +93,7 @@
               <w:rPr>
                 <w:b/>
               </w:rPr>
-              <w:t>Accuracy</w:t>
-            </w:r>
-          </w:p>
-        </w:tc>
-      </w:tr>
-      <w:tr>
-        <w:tc>
-          <w:tcPr>
-            <w:tcW w:type="dxa" w:w="4320"/>
-          </w:tcPr>
-          <w:p>
-            <w:r/>
-            <w:r>
-              <w:t>Reference fusion</w:t>
-            </w:r>
-          </w:p>
-        </w:tc>
-        <w:tc>
-          <w:tcPr>
-            <w:tcW w:type="dxa" w:w="4320"/>
-          </w:tcPr>
-          <w:p>
-            <w:pPr>
-              <w:jc w:val="center"/>
-            </w:pPr>
-            <w:r/>
-            <w:r>
-              <w:t>0.997</w:t>
-            </w:r>
-          </w:p>
-        </w:tc>
-      </w:tr>
-      <w:tr>
-        <w:tc>
-          <w:tcPr>
-            <w:tcW w:type="dxa" w:w="4320"/>
-          </w:tcPr>
-          <w:p>
-            <w:r/>
-            <w:r>
-              <w:t>Sound only</w:t>
-            </w:r>
-          </w:p>
-        </w:tc>
-        <w:tc>
-          <w:tcPr>
-            <w:tcW w:type="dxa" w:w="4320"/>
-          </w:tcPr>
-          <w:p>
-            <w:pPr>
-              <w:jc w:val="center"/>
-            </w:pPr>
-            <w:r/>
-            <w:r>
-              <w:t>0.999</w:t>
-            </w:r>
-          </w:p>
-        </w:tc>
-      </w:tr>
-      <w:tr>
-        <w:tc>
-          <w:tcPr>
-            <w:tcW w:type="dxa" w:w="4320"/>
-          </w:tcPr>
-          <w:p>
-            <w:r/>
-            <w:r>
-              <w:t>Hybrid</w:t>
-            </w:r>
-          </w:p>
-        </w:tc>
-        <w:tc>
-          <w:tcPr>
-            <w:tcW w:type="dxa" w:w="4320"/>
-          </w:tcPr>
-          <w:p>
-            <w:pPr>
-              <w:jc w:val="center"/>
-            </w:pPr>
-            <w:r/>
-            <w:r>
-              <w:t>1.000</w:t>
+              <w:t>Value</w:t>
             </w:r>
           </w:p>
         </w:tc>
@@ -309,9 +107,9 @@
             <w:r/>
             <w:r>
               <w:rPr>
-                <w:b/>
+                <w:b w:val="0"/>
               </w:rPr>
-              <w:t>Early fusion</w:t>
+              <w:t>Recordings</w:t>
             </w:r>
           </w:p>
         </w:tc>
@@ -326,15 +124,159 @@
             <w:r/>
             <w:r>
               <w:rPr>
-                <w:b/>
+                <w:b w:val="0"/>
               </w:rPr>
-              <w:t>1.000</w:t>
+              <w:t>43 usable (23 clean, 20 noisy)</w:t>
+            </w:r>
+          </w:p>
+        </w:tc>
+      </w:tr>
+      <w:tr>
+        <w:tc>
+          <w:tcPr>
+            <w:tcW w:type="dxa" w:w="4320"/>
+          </w:tcPr>
+          <w:p>
+            <w:r/>
+            <w:r>
+              <w:rPr>
+                <w:b w:val="0"/>
+              </w:rPr>
+              <w:t>Length</w:t>
+            </w:r>
+          </w:p>
+        </w:tc>
+        <w:tc>
+          <w:tcPr>
+            <w:tcW w:type="dxa" w:w="4320"/>
+          </w:tcPr>
+          <w:p>
+            <w:pPr>
+              <w:jc w:val="center"/>
+            </w:pPr>
+            <w:r/>
+            <w:r>
+              <w:rPr>
+                <w:b w:val="0"/>
+              </w:rPr>
+              <w:t>mostly 180 s, some 100-300 s</w:t>
+            </w:r>
+          </w:p>
+        </w:tc>
+      </w:tr>
+      <w:tr>
+        <w:tc>
+          <w:tcPr>
+            <w:tcW w:type="dxa" w:w="4320"/>
+          </w:tcPr>
+          <w:p>
+            <w:r/>
+            <w:r>
+              <w:rPr>
+                <w:b w:val="0"/>
+              </w:rPr>
+              <w:t>Microphone</w:t>
+            </w:r>
+          </w:p>
+        </w:tc>
+        <w:tc>
+          <w:tcPr>
+            <w:tcW w:type="dxa" w:w="4320"/>
+          </w:tcPr>
+          <w:p>
+            <w:pPr>
+              <w:jc w:val="center"/>
+            </w:pPr>
+            <w:r/>
+            <w:r>
+              <w:rPr>
+                <w:b w:val="0"/>
+              </w:rPr>
+              <w:t>2 channels, 48 kHz</w:t>
+            </w:r>
+          </w:p>
+        </w:tc>
+      </w:tr>
+      <w:tr>
+        <w:tc>
+          <w:tcPr>
+            <w:tcW w:type="dxa" w:w="4320"/>
+          </w:tcPr>
+          <w:p>
+            <w:r/>
+            <w:r>
+              <w:rPr>
+                <w:b w:val="0"/>
+              </w:rPr>
+              <w:t>Accelerometer</w:t>
+            </w:r>
+          </w:p>
+        </w:tc>
+        <w:tc>
+          <w:tcPr>
+            <w:tcW w:type="dxa" w:w="4320"/>
+          </w:tcPr>
+          <w:p>
+            <w:pPr>
+              <w:jc w:val="center"/>
+            </w:pPr>
+            <w:r/>
+            <w:r>
+              <w:rPr>
+                <w:b w:val="0"/>
+              </w:rPr>
+              <w:t>3 axes, 4 kHz</w:t>
+            </w:r>
+          </w:p>
+        </w:tc>
+      </w:tr>
+      <w:tr>
+        <w:tc>
+          <w:tcPr>
+            <w:tcW w:type="dxa" w:w="4320"/>
+          </w:tcPr>
+          <w:p>
+            <w:r/>
+            <w:r>
+              <w:rPr>
+                <w:b w:val="0"/>
+              </w:rPr>
+              <w:t>Labels</w:t>
+            </w:r>
+          </w:p>
+        </w:tc>
+        <w:tc>
+          <w:tcPr>
+            <w:tcW w:type="dxa" w:w="4320"/>
+          </w:tcPr>
+          <w:p>
+            <w:pPr>
+              <w:jc w:val="center"/>
+            </w:pPr>
+            <w:r/>
+            <w:r>
+              <w:rPr>
+                <w:b w:val="0"/>
+              </w:rPr>
+              <w:t>one valve setting per recording</w:t>
             </w:r>
           </w:p>
         </w:tc>
       </w:tr>
     </w:tbl>
     <w:p/>
+    <w:p>
+      <w:pPr>
+        <w:spacing w:after="140"/>
+      </w:pPr>
+      <w:r>
+        <w:rPr>
+          <w:b w:val="0"/>
+          <w:i w:val="0"/>
+        </w:rPr>
+        <w:t>Clean and noisy (second pump running) are treated as two separate datasets, as instructed. One recording (20260401_133648) was dropped because its accelerometer file is empty. The IMU and piezo files are empty throughout and were not used.</w:t>
+      </w:r>
+    </w:p>
     <w:p>
       <w:pPr>
         <w:spacing w:after="80"/>
@@ -344,7 +286,702 @@
           <w:b/>
           <w:i w:val="0"/>
         </w:rPr>
-        <w:t>New recordings (early fusion):</w:t>
+        <w:t>Recordings per class:</w:t>
+      </w:r>
+    </w:p>
+    <w:tbl>
+      <w:tblPr>
+        <w:tblStyle w:val="LightGrid-Accent1"/>
+        <w:tblW w:type="auto" w:w="0"/>
+        <w:tblLook w:firstColumn="1" w:firstRow="1" w:lastColumn="0" w:lastRow="0" w:noHBand="0" w:noVBand="1" w:val="04A0"/>
+      </w:tblPr>
+      <w:tblGrid>
+        <w:gridCol w:w="1234"/>
+        <w:gridCol w:w="1234"/>
+        <w:gridCol w:w="1234"/>
+        <w:gridCol w:w="1234"/>
+        <w:gridCol w:w="1234"/>
+        <w:gridCol w:w="1234"/>
+        <w:gridCol w:w="1234"/>
+      </w:tblGrid>
+      <w:tr>
+        <w:tc>
+          <w:tcPr>
+            <w:tcW w:type="dxa" w:w="1234"/>
+          </w:tcPr>
+          <w:p>
+            <w:r/>
+            <w:r>
+              <w:rPr>
+                <w:b/>
+              </w:rPr>
+            </w:r>
+          </w:p>
+        </w:tc>
+        <w:tc>
+          <w:tcPr>
+            <w:tcW w:type="dxa" w:w="1234"/>
+          </w:tcPr>
+          <w:p>
+            <w:r/>
+            <w:r>
+              <w:rPr>
+                <w:b/>
+              </w:rPr>
+              <w:t>nominal</w:t>
+            </w:r>
+          </w:p>
+        </w:tc>
+        <w:tc>
+          <w:tcPr>
+            <w:tcW w:type="dxa" w:w="1234"/>
+          </w:tcPr>
+          <w:p>
+            <w:r/>
+            <w:r>
+              <w:rPr>
+                <w:b/>
+              </w:rPr>
+              <w:t>75%</w:t>
+            </w:r>
+          </w:p>
+        </w:tc>
+        <w:tc>
+          <w:tcPr>
+            <w:tcW w:type="dxa" w:w="1234"/>
+          </w:tcPr>
+          <w:p>
+            <w:r/>
+            <w:r>
+              <w:rPr>
+                <w:b/>
+              </w:rPr>
+              <w:t>50%</w:t>
+            </w:r>
+          </w:p>
+        </w:tc>
+        <w:tc>
+          <w:tcPr>
+            <w:tcW w:type="dxa" w:w="1234"/>
+          </w:tcPr>
+          <w:p>
+            <w:r/>
+            <w:r>
+              <w:rPr>
+                <w:b/>
+              </w:rPr>
+              <w:t>25%</w:t>
+            </w:r>
+          </w:p>
+        </w:tc>
+        <w:tc>
+          <w:tcPr>
+            <w:tcW w:type="dxa" w:w="1234"/>
+          </w:tcPr>
+          <w:p>
+            <w:r/>
+            <w:r>
+              <w:rPr>
+                <w:b/>
+              </w:rPr>
+              <w:t>20%</w:t>
+            </w:r>
+          </w:p>
+        </w:tc>
+        <w:tc>
+          <w:tcPr>
+            <w:tcW w:type="dxa" w:w="1234"/>
+          </w:tcPr>
+          <w:p>
+            <w:r/>
+            <w:r>
+              <w:rPr>
+                <w:b/>
+              </w:rPr>
+              <w:t>15%</w:t>
+            </w:r>
+          </w:p>
+        </w:tc>
+      </w:tr>
+      <w:tr>
+        <w:tc>
+          <w:tcPr>
+            <w:tcW w:type="dxa" w:w="1234"/>
+          </w:tcPr>
+          <w:p>
+            <w:r/>
+            <w:r>
+              <w:rPr>
+                <w:b w:val="0"/>
+              </w:rPr>
+              <w:t>Clean</w:t>
+            </w:r>
+          </w:p>
+        </w:tc>
+        <w:tc>
+          <w:tcPr>
+            <w:tcW w:type="dxa" w:w="1234"/>
+          </w:tcPr>
+          <w:p>
+            <w:pPr>
+              <w:jc w:val="center"/>
+            </w:pPr>
+            <w:r/>
+            <w:r>
+              <w:rPr>
+                <w:b w:val="0"/>
+              </w:rPr>
+              <w:t>6</w:t>
+            </w:r>
+          </w:p>
+        </w:tc>
+        <w:tc>
+          <w:tcPr>
+            <w:tcW w:type="dxa" w:w="1234"/>
+          </w:tcPr>
+          <w:p>
+            <w:pPr>
+              <w:jc w:val="center"/>
+            </w:pPr>
+            <w:r/>
+            <w:r>
+              <w:rPr>
+                <w:b w:val="0"/>
+              </w:rPr>
+              <w:t>4</w:t>
+            </w:r>
+          </w:p>
+        </w:tc>
+        <w:tc>
+          <w:tcPr>
+            <w:tcW w:type="dxa" w:w="1234"/>
+          </w:tcPr>
+          <w:p>
+            <w:pPr>
+              <w:jc w:val="center"/>
+            </w:pPr>
+            <w:r/>
+            <w:r>
+              <w:rPr>
+                <w:b w:val="0"/>
+              </w:rPr>
+              <w:t>4</w:t>
+            </w:r>
+          </w:p>
+        </w:tc>
+        <w:tc>
+          <w:tcPr>
+            <w:tcW w:type="dxa" w:w="1234"/>
+          </w:tcPr>
+          <w:p>
+            <w:pPr>
+              <w:jc w:val="center"/>
+            </w:pPr>
+            <w:r/>
+            <w:r>
+              <w:rPr>
+                <w:b w:val="0"/>
+              </w:rPr>
+              <w:t>5</w:t>
+            </w:r>
+          </w:p>
+        </w:tc>
+        <w:tc>
+          <w:tcPr>
+            <w:tcW w:type="dxa" w:w="1234"/>
+          </w:tcPr>
+          <w:p>
+            <w:pPr>
+              <w:jc w:val="center"/>
+            </w:pPr>
+            <w:r/>
+            <w:r>
+              <w:rPr>
+                <w:b w:val="0"/>
+              </w:rPr>
+              <w:t>2</w:t>
+            </w:r>
+          </w:p>
+        </w:tc>
+        <w:tc>
+          <w:tcPr>
+            <w:tcW w:type="dxa" w:w="1234"/>
+          </w:tcPr>
+          <w:p>
+            <w:pPr>
+              <w:jc w:val="center"/>
+            </w:pPr>
+            <w:r/>
+            <w:r>
+              <w:rPr>
+                <w:b w:val="0"/>
+              </w:rPr>
+              <w:t>2</w:t>
+            </w:r>
+          </w:p>
+        </w:tc>
+      </w:tr>
+      <w:tr>
+        <w:tc>
+          <w:tcPr>
+            <w:tcW w:type="dxa" w:w="1234"/>
+          </w:tcPr>
+          <w:p>
+            <w:r/>
+            <w:r>
+              <w:rPr>
+                <w:b w:val="0"/>
+              </w:rPr>
+              <w:t>Noisy</w:t>
+            </w:r>
+          </w:p>
+        </w:tc>
+        <w:tc>
+          <w:tcPr>
+            <w:tcW w:type="dxa" w:w="1234"/>
+          </w:tcPr>
+          <w:p>
+            <w:pPr>
+              <w:jc w:val="center"/>
+            </w:pPr>
+            <w:r/>
+            <w:r>
+              <w:rPr>
+                <w:b w:val="0"/>
+              </w:rPr>
+              <w:t>3</w:t>
+            </w:r>
+          </w:p>
+        </w:tc>
+        <w:tc>
+          <w:tcPr>
+            <w:tcW w:type="dxa" w:w="1234"/>
+          </w:tcPr>
+          <w:p>
+            <w:pPr>
+              <w:jc w:val="center"/>
+            </w:pPr>
+            <w:r/>
+            <w:r>
+              <w:rPr>
+                <w:b w:val="0"/>
+              </w:rPr>
+              <w:t>4</w:t>
+            </w:r>
+          </w:p>
+        </w:tc>
+        <w:tc>
+          <w:tcPr>
+            <w:tcW w:type="dxa" w:w="1234"/>
+          </w:tcPr>
+          <w:p>
+            <w:pPr>
+              <w:jc w:val="center"/>
+            </w:pPr>
+            <w:r/>
+            <w:r>
+              <w:rPr>
+                <w:b w:val="0"/>
+              </w:rPr>
+              <w:t>5</w:t>
+            </w:r>
+          </w:p>
+        </w:tc>
+        <w:tc>
+          <w:tcPr>
+            <w:tcW w:type="dxa" w:w="1234"/>
+          </w:tcPr>
+          <w:p>
+            <w:pPr>
+              <w:jc w:val="center"/>
+            </w:pPr>
+            <w:r/>
+            <w:r>
+              <w:rPr>
+                <w:b w:val="0"/>
+              </w:rPr>
+              <w:t>4</w:t>
+            </w:r>
+          </w:p>
+        </w:tc>
+        <w:tc>
+          <w:tcPr>
+            <w:tcW w:type="dxa" w:w="1234"/>
+          </w:tcPr>
+          <w:p>
+            <w:pPr>
+              <w:jc w:val="center"/>
+            </w:pPr>
+            <w:r/>
+            <w:r>
+              <w:rPr>
+                <w:b w:val="0"/>
+              </w:rPr>
+              <w:t>2</w:t>
+            </w:r>
+          </w:p>
+        </w:tc>
+        <w:tc>
+          <w:tcPr>
+            <w:tcW w:type="dxa" w:w="1234"/>
+          </w:tcPr>
+          <w:p>
+            <w:pPr>
+              <w:jc w:val="center"/>
+            </w:pPr>
+            <w:r/>
+            <w:r>
+              <w:rPr>
+                <w:b w:val="0"/>
+              </w:rPr>
+              <w:t>2</w:t>
+            </w:r>
+          </w:p>
+        </w:tc>
+      </w:tr>
+    </w:tbl>
+    <w:p/>
+    <w:p>
+      <w:pPr>
+        <w:spacing w:after="140"/>
+      </w:pPr>
+      <w:r>
+        <w:rPr>
+          <w:b w:val="0"/>
+          <w:i w:val="0"/>
+        </w:rPr>
+        <w:t>The two most severe settings have only two recordings each per condition, which turns out to be the main limit on performance.</w:t>
+      </w:r>
+    </w:p>
+    <w:p>
+      <w:pPr>
+        <w:pStyle w:val="Heading1"/>
+      </w:pPr>
+      <w:r>
+        <w:t>3. Pipeline</w:t>
+      </w:r>
+    </w:p>
+    <w:p>
+      <w:pPr>
+        <w:spacing w:after="140"/>
+      </w:pPr>
+      <w:r>
+        <w:rPr>
+          <w:b w:val="0"/>
+          <w:i w:val="0"/>
+        </w:rPr>
+        <w:t>Step 1 - Preparation. The raw CSV files are read once and each recording is stored compactly (accelerometer as float32, microphone as int16), together with an index listing every recording and its label. Done once and never repeated.</w:t>
+      </w:r>
+    </w:p>
+    <w:p>
+      <w:pPr>
+        <w:spacing w:after="140"/>
+      </w:pPr>
+      <w:r>
+        <w:rPr>
+          <w:b w:val="0"/>
+          <w:i w:val="0"/>
+        </w:rPr>
+        <w:t>Step 2 - Windows. Each recording is cut into 1-second windows. Training uses 50% overlap; testing uses none. Per window and per channel the mean is removed (this takes out gravity on the accelerometer) while the amplitude is kept, because vibration level itself carries information. Microphone samples are scaled to roughly plus/minus 1.</w:t>
+      </w:r>
+    </w:p>
+    <w:p>
+      <w:pPr>
+        <w:spacing w:after="140"/>
+      </w:pPr>
+      <w:r>
+        <w:rPr>
+          <w:b w:val="0"/>
+          <w:i w:val="0"/>
+        </w:rPr>
+        <w:t>Step 3 - Model. Described in section 5.</w:t>
+      </w:r>
+    </w:p>
+    <w:p>
+      <w:pPr>
+        <w:spacing w:after="140"/>
+      </w:pPr>
+      <w:r>
+        <w:rPr>
+          <w:b w:val="0"/>
+          <w:i w:val="0"/>
+        </w:rPr>
+        <w:t>Step 4 - Evaluation. Described in section 4.</w:t>
+      </w:r>
+    </w:p>
+    <w:p>
+      <w:pPr>
+        <w:spacing w:after="140"/>
+      </w:pPr>
+      <w:r>
+        <w:rPr>
+          <w:b w:val="0"/>
+          <w:i w:val="0"/>
+        </w:rPr>
+        <w:t>Training settings, identical for every model so comparisons are fair: AdamW, learning rate 1e-3, weight decay 1e-4, cosine schedule, batch size 32, 20 epochs, class weighting to compensate the uneven number of recordings, and a fixed random seed so every run reproduces exactly.</w:t>
+      </w:r>
+    </w:p>
+    <w:p>
+      <w:pPr>
+        <w:pStyle w:val="Heading1"/>
+      </w:pPr>
+      <w:r>
+        <w:t>4. How the models were evaluated</w:t>
+      </w:r>
+    </w:p>
+    <w:p>
+      <w:pPr>
+        <w:spacing w:after="140"/>
+      </w:pPr>
+      <w:r>
+        <w:rPr>
+          <w:b w:val="0"/>
+          <w:i w:val="0"/>
+        </w:rPr>
+        <w:t>Two protocols were used, and the difference between them turned out to be larger than the difference between any two models.</w:t>
+      </w:r>
+    </w:p>
+    <w:p>
+      <w:pPr>
+        <w:spacing w:after="40"/>
+      </w:pPr>
+      <w:r>
+        <w:rPr>
+          <w:b/>
+          <w:i w:val="0"/>
+        </w:rPr>
+        <w:t>Shuffled windows.</w:t>
+      </w:r>
+    </w:p>
+    <w:p>
+      <w:pPr>
+        <w:spacing w:after="140"/>
+      </w:pPr>
+      <w:r>
+        <w:rPr>
+          <w:b w:val="0"/>
+          <w:i w:val="0"/>
+        </w:rPr>
+        <w:t>All windows from all recordings are pooled, shuffled, and split 70/15/15. This is the protocol in the reference MATLAB implementation (randperm over all observations). Because windows from the same recording appear in both training and test, and neighbouring windows of a steady recording are nearly identical, the model is tested on data very similar to what it trained on.</w:t>
+      </w:r>
+    </w:p>
+    <w:p>
+      <w:pPr>
+        <w:spacing w:after="40"/>
+      </w:pPr>
+      <w:r>
+        <w:rPr>
+          <w:b/>
+          <w:i w:val="0"/>
+        </w:rPr>
+        <w:t>New recordings.</w:t>
+      </w:r>
+    </w:p>
+    <w:p>
+      <w:pPr>
+        <w:spacing w:after="140"/>
+      </w:pPr>
+      <w:r>
+        <w:rPr>
+          <w:b w:val="0"/>
+          <w:i w:val="0"/>
+        </w:rPr>
+        <w:t>A whole recording is held out, the model trains on the remaining ones, and this repeats until every recording has been the test recording once. Training and test never share a recording. Since each recording is a single operating point, this measures whether the model recognises a recording it has never seen.</w:t>
+      </w:r>
+    </w:p>
+    <w:p>
+      <w:pPr>
+        <w:spacing w:after="140"/>
+      </w:pPr>
+      <w:r>
+        <w:rPr>
+          <w:b w:val="0"/>
+          <w:i w:val="0"/>
+        </w:rPr>
+        <w:t>For the larger pooled experiments, 4 folds of several recordings were used instead of one at a time. Whole recordings still stay together, so there is no overlap; it simply trains 4 models instead of 43.</w:t>
+      </w:r>
+    </w:p>
+    <w:p>
+      <w:pPr>
+        <w:spacing w:after="140"/>
+      </w:pPr>
+      <w:r>
+        <w:rPr>
+          <w:b w:val="0"/>
+          <w:i w:val="0"/>
+        </w:rPr>
+        <w:t>Each recording's answer is the average of its window predictions. Results are reported three ways: the exact 6 settings, the three physical levels, and cavitation versus no cavitation.</w:t>
+      </w:r>
+    </w:p>
+    <w:p>
+      <w:pPr>
+        <w:pStyle w:val="Heading1"/>
+      </w:pPr>
+      <w:r>
+        <w:t>5. Models tried</w:t>
+      </w:r>
+    </w:p>
+    <w:p>
+      <w:pPr>
+        <w:spacing w:after="140"/>
+      </w:pPr>
+      <w:r>
+        <w:rPr>
+          <w:b/>
+        </w:rPr>
+        <w:t xml:space="preserve">Sound only / vibration only. </w:t>
+      </w:r>
+      <w:r>
+        <w:t>Single-branch 1-D CNN on the raw signal. Used as baselines.</w:t>
+      </w:r>
+    </w:p>
+    <w:p>
+      <w:pPr>
+        <w:spacing w:after="140"/>
+      </w:pPr>
+      <w:r>
+        <w:rPr>
+          <w:b/>
+        </w:rPr>
+        <w:t xml:space="preserve">Fusion (intermediate). </w:t>
+      </w:r>
+      <w:r>
+        <w:t>Two parallel 1-D CNN branches, one per sensor, each reduced to a feature vector by global average pooling, then concatenated and classified. This mirrors the structure of the reference implementation and works directly on the time-domain signal.</w:t>
+      </w:r>
+    </w:p>
+    <w:p>
+      <w:pPr>
+        <w:spacing w:after="140"/>
+      </w:pPr>
+      <w:r>
+        <w:rPr>
+          <w:b/>
+        </w:rPr>
+        <w:t xml:space="preserve">Gated fusion. </w:t>
+      </w:r>
+      <w:r>
+        <w:t>As above, but a small gate reads both feature vectors and weights each modality, so an unreliable sensor can be turned down instead of dragging the result along.</w:t>
+      </w:r>
+    </w:p>
+    <w:p>
+      <w:pPr>
+        <w:spacing w:after="140"/>
+      </w:pPr>
+      <w:r>
+        <w:rPr>
+          <w:b/>
+        </w:rPr>
+        <w:t xml:space="preserve">Spectral fusion. </w:t>
+      </w:r>
+      <w:r>
+        <w:t>Each signal is converted to a spectrogram and processed by a 2-D CNN branch, then fused. Motivated by cavitation being an impulsive, broadband phenomenon that is clearer in the frequency domain.</w:t>
+      </w:r>
+    </w:p>
+    <w:p>
+      <w:pPr>
+        <w:spacing w:after="140"/>
+      </w:pPr>
+      <w:r>
+        <w:rPr>
+          <w:b/>
+        </w:rPr>
+        <w:t xml:space="preserve">Hybrid. </w:t>
+      </w:r>
+      <w:r>
+        <w:t>Raw signal branch, spectrogram branch, and a small set of hand-crafted descriptors (RMS, kurtosis, crest factor, spectral centroid, high-frequency ratio), all combined.</w:t>
+      </w:r>
+    </w:p>
+    <w:p>
+      <w:pPr>
+        <w:spacing w:after="140"/>
+      </w:pPr>
+      <w:r>
+        <w:rPr>
+          <w:b/>
+        </w:rPr>
+        <w:t xml:space="preserve">Early fusion (final model). </w:t>
+      </w:r>
+      <w:r>
+        <w:t>Both signals are turned into spectrograms, resized to a common 64x64 grid, and stacked as the channels of a single image (2 microphone + 3 accelerometer = 5 channels). One CNN reads that image, so the two sensors are combined at the input rather than in separate branches. Four convolution blocks (16, 32, 64, 128 filters, 3x3 kernels, max pooling), global average pooling, then a small classifier. About 115k parameters, less than half the size of the hybrid model.</w:t>
+      </w:r>
+    </w:p>
+    <w:p>
+      <w:pPr>
+        <w:jc w:val="center"/>
+      </w:pPr>
+      <w:r>
+        <w:drawing>
+          <wp:inline xmlns:a="http://schemas.openxmlformats.org/drawingml/2006/main" xmlns:pic="http://schemas.openxmlformats.org/drawingml/2006/picture">
+            <wp:extent cx="5760720" cy="1382662"/>
+            <wp:docPr id="1" name="Picture 1"/>
+            <wp:cNvGraphicFramePr>
+              <a:graphicFrameLocks noChangeAspect="1"/>
+            </wp:cNvGraphicFramePr>
+            <a:graphic>
+              <a:graphicData uri="http://schemas.openxmlformats.org/drawingml/2006/picture">
+                <pic:pic>
+                  <pic:nvPicPr>
+                    <pic:cNvPr id="0" name="model_diagram.png"/>
+                    <pic:cNvPicPr/>
+                  </pic:nvPicPr>
+                  <pic:blipFill>
+                    <a:blip r:embed="rId9"/>
+                    <a:stretch>
+                      <a:fillRect/>
+                    </a:stretch>
+                  </pic:blipFill>
+                  <pic:spPr>
+                    <a:xfrm>
+                      <a:off x="0" y="0"/>
+                      <a:ext cx="5760720" cy="1382662"/>
+                    </a:xfrm>
+                    <a:prstGeom prst="rect"/>
+                  </pic:spPr>
+                </pic:pic>
+              </a:graphicData>
+            </a:graphic>
+          </wp:inline>
+        </w:drawing>
+      </w:r>
+    </w:p>
+    <w:p>
+      <w:pPr>
+        <w:jc w:val="center"/>
+      </w:pPr>
+      <w:r>
+        <w:rPr>
+          <w:i/>
+          <w:sz w:val="18"/>
+        </w:rPr>
+        <w:t>Both signals become spectrograms, are stacked into one image, and are read by a single network.</w:t>
+      </w:r>
+    </w:p>
+    <w:p>
+      <w:pPr>
+        <w:pStyle w:val="Heading1"/>
+      </w:pPr>
+      <w:r>
+        <w:t>6. Results</w:t>
+      </w:r>
+    </w:p>
+    <w:p>
+      <w:pPr>
+        <w:pStyle w:val="Heading2"/>
+      </w:pPr>
+      <w:r>
+        <w:t>6.1 Final model, new-recording test</w:t>
+      </w:r>
+    </w:p>
+    <w:p>
+      <w:pPr>
+        <w:spacing w:after="80"/>
+      </w:pPr>
+      <w:r>
+        <w:rPr>
+          <w:b w:val="0"/>
+          <w:i w:val="0"/>
+        </w:rPr>
+        <w:t>Early fusion, clean and noisy kept separate:</w:t>
       </w:r>
     </w:p>
     <w:tbl>
@@ -425,6 +1062,9 @@
           <w:p>
             <w:r/>
             <w:r>
+              <w:rPr>
+                <w:b w:val="0"/>
+              </w:rPr>
               <w:t>Clean</w:t>
             </w:r>
           </w:p>
@@ -439,6 +1079,9 @@
             </w:pPr>
             <w:r/>
             <w:r>
+              <w:rPr>
+                <w:b w:val="0"/>
+              </w:rPr>
               <w:t>0.70 (16/23)</w:t>
             </w:r>
           </w:p>
@@ -453,6 +1096,9 @@
             </w:pPr>
             <w:r/>
             <w:r>
+              <w:rPr>
+                <w:b w:val="0"/>
+              </w:rPr>
               <w:t>0.96 (22/23)</w:t>
             </w:r>
           </w:p>
@@ -483,6 +1129,9 @@
           <w:p>
             <w:r/>
             <w:r>
+              <w:rPr>
+                <w:b w:val="0"/>
+              </w:rPr>
               <w:t>Noisy</w:t>
             </w:r>
           </w:p>
@@ -497,6 +1146,9 @@
             </w:pPr>
             <w:r/>
             <w:r>
+              <w:rPr>
+                <w:b w:val="0"/>
+              </w:rPr>
               <w:t>0.80 (16/20)</w:t>
             </w:r>
           </w:p>
@@ -511,6 +1163,9 @@
             </w:pPr>
             <w:r/>
             <w:r>
+              <w:rPr>
+                <w:b w:val="0"/>
+              </w:rPr>
               <w:t>0.95 (19/20)</w:t>
             </w:r>
           </w:p>
@@ -536,80 +1191,1014 @@
     </w:tbl>
     <w:p/>
     <w:p>
-      <w:r>
-        <w:rPr>
-          <w:i/>
-          <w:sz w:val="18"/>
-        </w:rPr>
-        <w:t>3 levels = none (nominal, 75%, 50%) / onset (25%) / developing (20%, 15%).</w:t>
-      </w:r>
-    </w:p>
-    <w:p>
       <w:pPr>
-        <w:pStyle w:val="Heading1"/>
-      </w:pPr>
-      <w:r>
-        <w:t>Error analysis</w:t>
-      </w:r>
-    </w:p>
-    <w:p>
-      <w:pPr>
-        <w:spacing w:after="160"/>
+        <w:spacing w:after="140"/>
       </w:pPr>
       <w:r>
         <w:rPr>
           <w:b w:val="0"/>
           <w:i w:val="0"/>
         </w:rPr>
-        <w:t>Every misclassification is between neighbouring, physically similar settings:</w:t>
+        <w:t>Cavitation is separated from no cavitation without a single mistake in either condition.</w:t>
       </w:r>
     </w:p>
     <w:p>
       <w:pPr>
-        <w:pStyle w:val="ListBullet"/>
+        <w:pStyle w:val="Heading2"/>
       </w:pPr>
       <w:r>
-        <w:t>nominal vs. 75% — both without cavitation, differing only in flow rate.</w:t>
+        <w:t>6.2 All models on the same footing</w:t>
       </w:r>
     </w:p>
     <w:p>
       <w:pPr>
-        <w:pStyle w:val="ListBullet"/>
-      </w:pPr>
-      <w:r>
-        <w:t>20% vs. 15% — both in the developing region.</w:t>
-      </w:r>
-    </w:p>
-    <w:p>
-      <w:pPr>
-        <w:spacing w:after="160"/>
+        <w:spacing w:after="80"/>
       </w:pPr>
       <w:r>
         <w:rPr>
           <w:b w:val="0"/>
           <w:i w:val="0"/>
         </w:rPr>
-        <w:t>No recording with cavitation was ever classified as no cavitation, in either condition.</w:t>
+        <w:t>Pooled recordings, 4 folds, identical training settings:</w:t>
       </w:r>
     </w:p>
+    <w:tbl>
+      <w:tblPr>
+        <w:tblStyle w:val="LightGrid-Accent1"/>
+        <w:tblW w:type="auto" w:w="0"/>
+        <w:tblLook w:firstColumn="1" w:firstRow="1" w:lastColumn="0" w:lastRow="0" w:noHBand="0" w:noVBand="1" w:val="04A0"/>
+      </w:tblPr>
+      <w:tblGrid>
+        <w:gridCol w:w="1728"/>
+        <w:gridCol w:w="1728"/>
+        <w:gridCol w:w="1728"/>
+        <w:gridCol w:w="1728"/>
+        <w:gridCol w:w="1728"/>
+      </w:tblGrid>
+      <w:tr>
+        <w:tc>
+          <w:tcPr>
+            <w:tcW w:type="dxa" w:w="1728"/>
+          </w:tcPr>
+          <w:p>
+            <w:r/>
+            <w:r>
+              <w:rPr>
+                <w:b/>
+              </w:rPr>
+              <w:t>Model</w:t>
+            </w:r>
+          </w:p>
+        </w:tc>
+        <w:tc>
+          <w:tcPr>
+            <w:tcW w:type="dxa" w:w="1728"/>
+          </w:tcPr>
+          <w:p>
+            <w:r/>
+            <w:r>
+              <w:rPr>
+                <w:b/>
+              </w:rPr>
+              <w:t>Input</w:t>
+            </w:r>
+          </w:p>
+        </w:tc>
+        <w:tc>
+          <w:tcPr>
+            <w:tcW w:type="dxa" w:w="1728"/>
+          </w:tcPr>
+          <w:p>
+            <w:r/>
+            <w:r>
+              <w:rPr>
+                <w:b/>
+              </w:rPr>
+              <w:t>6 apertures</w:t>
+            </w:r>
+          </w:p>
+        </w:tc>
+        <w:tc>
+          <w:tcPr>
+            <w:tcW w:type="dxa" w:w="1728"/>
+          </w:tcPr>
+          <w:p>
+            <w:r/>
+            <w:r>
+              <w:rPr>
+                <w:b/>
+              </w:rPr>
+              <w:t>3 levels</w:t>
+            </w:r>
+          </w:p>
+        </w:tc>
+        <w:tc>
+          <w:tcPr>
+            <w:tcW w:type="dxa" w:w="1728"/>
+          </w:tcPr>
+          <w:p>
+            <w:r/>
+            <w:r>
+              <w:rPr>
+                <w:b/>
+              </w:rPr>
+              <w:t>Cavitation</w:t>
+            </w:r>
+          </w:p>
+        </w:tc>
+      </w:tr>
+      <w:tr>
+        <w:tc>
+          <w:tcPr>
+            <w:tcW w:type="dxa" w:w="1728"/>
+          </w:tcPr>
+          <w:p>
+            <w:r/>
+            <w:r>
+              <w:rPr>
+                <w:b/>
+              </w:rPr>
+              <w:t>Early fusion</w:t>
+            </w:r>
+          </w:p>
+        </w:tc>
+        <w:tc>
+          <w:tcPr>
+            <w:tcW w:type="dxa" w:w="1728"/>
+          </w:tcPr>
+          <w:p>
+            <w:pPr>
+              <w:jc w:val="center"/>
+            </w:pPr>
+            <w:r/>
+            <w:r>
+              <w:rPr>
+                <w:b w:val="0"/>
+              </w:rPr>
+              <w:t>spectrograms</w:t>
+            </w:r>
+          </w:p>
+        </w:tc>
+        <w:tc>
+          <w:tcPr>
+            <w:tcW w:type="dxa" w:w="1728"/>
+          </w:tcPr>
+          <w:p>
+            <w:pPr>
+              <w:jc w:val="center"/>
+            </w:pPr>
+            <w:r/>
+            <w:r>
+              <w:rPr>
+                <w:b/>
+              </w:rPr>
+              <w:t>0.84 (36/43)</w:t>
+            </w:r>
+          </w:p>
+        </w:tc>
+        <w:tc>
+          <w:tcPr>
+            <w:tcW w:type="dxa" w:w="1728"/>
+          </w:tcPr>
+          <w:p>
+            <w:pPr>
+              <w:jc w:val="center"/>
+            </w:pPr>
+            <w:r/>
+            <w:r>
+              <w:rPr>
+                <w:b/>
+              </w:rPr>
+              <w:t>1.00</w:t>
+            </w:r>
+          </w:p>
+        </w:tc>
+        <w:tc>
+          <w:tcPr>
+            <w:tcW w:type="dxa" w:w="1728"/>
+          </w:tcPr>
+          <w:p>
+            <w:pPr>
+              <w:jc w:val="center"/>
+            </w:pPr>
+            <w:r/>
+            <w:r>
+              <w:rPr>
+                <w:b w:val="0"/>
+              </w:rPr>
+              <w:t>1.00</w:t>
+            </w:r>
+          </w:p>
+        </w:tc>
+      </w:tr>
+      <w:tr>
+        <w:tc>
+          <w:tcPr>
+            <w:tcW w:type="dxa" w:w="1728"/>
+          </w:tcPr>
+          <w:p>
+            <w:r/>
+            <w:r>
+              <w:rPr>
+                <w:b w:val="0"/>
+              </w:rPr>
+              <w:t>Aperture as a number</w:t>
+            </w:r>
+          </w:p>
+        </w:tc>
+        <w:tc>
+          <w:tcPr>
+            <w:tcW w:type="dxa" w:w="1728"/>
+          </w:tcPr>
+          <w:p>
+            <w:pPr>
+              <w:jc w:val="center"/>
+            </w:pPr>
+            <w:r/>
+            <w:r>
+              <w:rPr>
+                <w:b w:val="0"/>
+              </w:rPr>
+              <w:t>spectrograms</w:t>
+            </w:r>
+          </w:p>
+        </w:tc>
+        <w:tc>
+          <w:tcPr>
+            <w:tcW w:type="dxa" w:w="1728"/>
+          </w:tcPr>
+          <w:p>
+            <w:pPr>
+              <w:jc w:val="center"/>
+            </w:pPr>
+            <w:r/>
+            <w:r>
+              <w:rPr>
+                <w:b w:val="0"/>
+              </w:rPr>
+              <w:t>0.79 (34/43)</w:t>
+            </w:r>
+          </w:p>
+        </w:tc>
+        <w:tc>
+          <w:tcPr>
+            <w:tcW w:type="dxa" w:w="1728"/>
+          </w:tcPr>
+          <w:p>
+            <w:pPr>
+              <w:jc w:val="center"/>
+            </w:pPr>
+            <w:r/>
+            <w:r>
+              <w:rPr>
+                <w:b w:val="0"/>
+              </w:rPr>
+              <w:t>0.98</w:t>
+            </w:r>
+          </w:p>
+        </w:tc>
+        <w:tc>
+          <w:tcPr>
+            <w:tcW w:type="dxa" w:w="1728"/>
+          </w:tcPr>
+          <w:p>
+            <w:pPr>
+              <w:jc w:val="center"/>
+            </w:pPr>
+            <w:r/>
+            <w:r>
+              <w:rPr>
+                <w:b w:val="0"/>
+              </w:rPr>
+              <w:t>1.00</w:t>
+            </w:r>
+          </w:p>
+        </w:tc>
+      </w:tr>
+      <w:tr>
+        <w:tc>
+          <w:tcPr>
+            <w:tcW w:type="dxa" w:w="1728"/>
+          </w:tcPr>
+          <w:p>
+            <w:r/>
+            <w:r>
+              <w:rPr>
+                <w:b w:val="0"/>
+              </w:rPr>
+              <w:t>Fusion (intermediate)</w:t>
+            </w:r>
+          </w:p>
+        </w:tc>
+        <w:tc>
+          <w:tcPr>
+            <w:tcW w:type="dxa" w:w="1728"/>
+          </w:tcPr>
+          <w:p>
+            <w:pPr>
+              <w:jc w:val="center"/>
+            </w:pPr>
+            <w:r/>
+            <w:r>
+              <w:rPr>
+                <w:b w:val="0"/>
+              </w:rPr>
+              <w:t>raw time domain</w:t>
+            </w:r>
+          </w:p>
+        </w:tc>
+        <w:tc>
+          <w:tcPr>
+            <w:tcW w:type="dxa" w:w="1728"/>
+          </w:tcPr>
+          <w:p>
+            <w:pPr>
+              <w:jc w:val="center"/>
+            </w:pPr>
+            <w:r/>
+            <w:r>
+              <w:rPr>
+                <w:b w:val="0"/>
+              </w:rPr>
+              <w:t>0.74 (32/43)</w:t>
+            </w:r>
+          </w:p>
+        </w:tc>
+        <w:tc>
+          <w:tcPr>
+            <w:tcW w:type="dxa" w:w="1728"/>
+          </w:tcPr>
+          <w:p>
+            <w:pPr>
+              <w:jc w:val="center"/>
+            </w:pPr>
+            <w:r/>
+            <w:r>
+              <w:rPr>
+                <w:b w:val="0"/>
+              </w:rPr>
+              <w:t>0.98</w:t>
+            </w:r>
+          </w:p>
+        </w:tc>
+        <w:tc>
+          <w:tcPr>
+            <w:tcW w:type="dxa" w:w="1728"/>
+          </w:tcPr>
+          <w:p>
+            <w:pPr>
+              <w:jc w:val="center"/>
+            </w:pPr>
+            <w:r/>
+            <w:r>
+              <w:rPr>
+                <w:b w:val="0"/>
+              </w:rPr>
+              <w:t>1.00</w:t>
+            </w:r>
+          </w:p>
+        </w:tc>
+      </w:tr>
+    </w:tbl>
+    <w:p/>
     <w:p>
       <w:pPr>
-        <w:pStyle w:val="Heading1"/>
-      </w:pPr>
-      <w:r>
-        <w:t>Supplementary: pooling clean and noisy</w:t>
-      </w:r>
-    </w:p>
-    <w:p>
-      <w:pPr>
-        <w:spacing w:after="160"/>
+        <w:spacing w:after="140"/>
       </w:pPr>
       <w:r>
         <w:rPr>
           <w:b w:val="0"/>
           <w:i w:val="0"/>
         </w:rPr>
-        <w:t>I kept clean and noisy separate as you advised. To see what that costs, I also ran the same model on all 43 recordings together, still holding out whole recordings so there is no leakage:</w:t>
+        <w:t>Earlier runs, before the seed was fixed and under other protocols, are consistent with this ordering: sound only 0.65, hybrid 0.74, spectral 0.61, gated fusion 0.70.</w:t>
+      </w:r>
+    </w:p>
+    <w:p>
+      <w:pPr>
+        <w:pStyle w:val="Heading2"/>
+      </w:pPr>
+      <w:r>
+        <w:t>6.3 Is the time-frequency transform worth it?</w:t>
+      </w:r>
+    </w:p>
+    <w:p>
+      <w:pPr>
+        <w:spacing w:after="80"/>
+      </w:pPr>
+      <w:r>
+        <w:rPr>
+          <w:b w:val="0"/>
+          <w:i w:val="0"/>
+        </w:rPr>
+        <w:t>Relevant for running on a low-end device, where a spectrogram is expensive:</w:t>
+      </w:r>
+    </w:p>
+    <w:tbl>
+      <w:tblPr>
+        <w:tblStyle w:val="LightGrid-Accent1"/>
+        <w:tblW w:type="auto" w:w="0"/>
+        <w:tblLook w:firstColumn="1" w:firstRow="1" w:lastColumn="0" w:lastRow="0" w:noHBand="0" w:noVBand="1" w:val="04A0"/>
+      </w:tblPr>
+      <w:tblGrid>
+        <w:gridCol w:w="2880"/>
+        <w:gridCol w:w="2880"/>
+        <w:gridCol w:w="2880"/>
+      </w:tblGrid>
+      <w:tr>
+        <w:tc>
+          <w:tcPr>
+            <w:tcW w:type="dxa" w:w="2880"/>
+          </w:tcPr>
+          <w:p>
+            <w:r/>
+            <w:r>
+              <w:rPr>
+                <w:b/>
+              </w:rPr>
+            </w:r>
+          </w:p>
+        </w:tc>
+        <w:tc>
+          <w:tcPr>
+            <w:tcW w:type="dxa" w:w="2880"/>
+          </w:tcPr>
+          <w:p>
+            <w:r/>
+            <w:r>
+              <w:rPr>
+                <w:b/>
+              </w:rPr>
+              <w:t>6 apertures</w:t>
+            </w:r>
+          </w:p>
+        </w:tc>
+        <w:tc>
+          <w:tcPr>
+            <w:tcW w:type="dxa" w:w="2880"/>
+          </w:tcPr>
+          <w:p>
+            <w:r/>
+            <w:r>
+              <w:rPr>
+                <w:b/>
+              </w:rPr>
+              <w:t>Cavitation vs. none</w:t>
+            </w:r>
+          </w:p>
+        </w:tc>
+      </w:tr>
+      <w:tr>
+        <w:tc>
+          <w:tcPr>
+            <w:tcW w:type="dxa" w:w="2880"/>
+          </w:tcPr>
+          <w:p>
+            <w:r/>
+            <w:r>
+              <w:rPr>
+                <w:b w:val="0"/>
+              </w:rPr>
+              <w:t>Raw time domain (no transform)</w:t>
+            </w:r>
+          </w:p>
+        </w:tc>
+        <w:tc>
+          <w:tcPr>
+            <w:tcW w:type="dxa" w:w="2880"/>
+          </w:tcPr>
+          <w:p>
+            <w:pPr>
+              <w:jc w:val="center"/>
+            </w:pPr>
+            <w:r/>
+            <w:r>
+              <w:rPr>
+                <w:b w:val="0"/>
+              </w:rPr>
+              <w:t>0.74</w:t>
+            </w:r>
+          </w:p>
+        </w:tc>
+        <w:tc>
+          <w:tcPr>
+            <w:tcW w:type="dxa" w:w="2880"/>
+          </w:tcPr>
+          <w:p>
+            <w:pPr>
+              <w:jc w:val="center"/>
+            </w:pPr>
+            <w:r/>
+            <w:r>
+              <w:rPr>
+                <w:b/>
+              </w:rPr>
+              <w:t>1.00</w:t>
+            </w:r>
+          </w:p>
+        </w:tc>
+      </w:tr>
+      <w:tr>
+        <w:tc>
+          <w:tcPr>
+            <w:tcW w:type="dxa" w:w="2880"/>
+          </w:tcPr>
+          <w:p>
+            <w:r/>
+            <w:r>
+              <w:rPr>
+                <w:b w:val="0"/>
+              </w:rPr>
+              <w:t>Spectrograms</w:t>
+            </w:r>
+          </w:p>
+        </w:tc>
+        <w:tc>
+          <w:tcPr>
+            <w:tcW w:type="dxa" w:w="2880"/>
+          </w:tcPr>
+          <w:p>
+            <w:pPr>
+              <w:jc w:val="center"/>
+            </w:pPr>
+            <w:r/>
+            <w:r>
+              <w:rPr>
+                <w:b/>
+              </w:rPr>
+              <w:t>0.84</w:t>
+            </w:r>
+          </w:p>
+        </w:tc>
+        <w:tc>
+          <w:tcPr>
+            <w:tcW w:type="dxa" w:w="2880"/>
+          </w:tcPr>
+          <w:p>
+            <w:pPr>
+              <w:jc w:val="center"/>
+            </w:pPr>
+            <w:r/>
+            <w:r>
+              <w:rPr>
+                <w:b/>
+              </w:rPr>
+              <w:t>1.00</w:t>
+            </w:r>
+          </w:p>
+        </w:tc>
+      </w:tr>
+    </w:tbl>
+    <w:p/>
+    <w:p>
+      <w:pPr>
+        <w:spacing w:after="140"/>
+      </w:pPr>
+      <w:r>
+        <w:rPr>
+          <w:b w:val="0"/>
+          <w:i w:val="0"/>
+        </w:rPr>
+        <w:t>The transform is worth about 9 points on the exact six settings, but nothing at all for detecting cavitation, where both reach 100%. So if the goal on the device is to answer "is the pump cavitating", the cheap time-domain model is enough and no transform is needed. The transform only pays off if the exact aperture is required.</w:t>
+      </w:r>
+    </w:p>
+    <w:p>
+      <w:pPr>
+        <w:pStyle w:val="Heading2"/>
+      </w:pPr>
+      <w:r>
+        <w:t>6.4 Shuffled windows, for comparison</w:t>
+      </w:r>
+    </w:p>
+    <w:tbl>
+      <w:tblPr>
+        <w:tblStyle w:val="LightGrid-Accent1"/>
+        <w:tblW w:type="auto" w:w="0"/>
+        <w:tblLook w:firstColumn="1" w:firstRow="1" w:lastColumn="0" w:lastRow="0" w:noHBand="0" w:noVBand="1" w:val="04A0"/>
+      </w:tblPr>
+      <w:tblGrid>
+        <w:gridCol w:w="4320"/>
+        <w:gridCol w:w="4320"/>
+      </w:tblGrid>
+      <w:tr>
+        <w:tc>
+          <w:tcPr>
+            <w:tcW w:type="dxa" w:w="4320"/>
+          </w:tcPr>
+          <w:p>
+            <w:r/>
+            <w:r>
+              <w:rPr>
+                <w:b/>
+              </w:rPr>
+              <w:t>Model</w:t>
+            </w:r>
+          </w:p>
+        </w:tc>
+        <w:tc>
+          <w:tcPr>
+            <w:tcW w:type="dxa" w:w="4320"/>
+          </w:tcPr>
+          <w:p>
+            <w:r/>
+            <w:r>
+              <w:rPr>
+                <w:b/>
+              </w:rPr>
+              <w:t>Accuracy</w:t>
+            </w:r>
+          </w:p>
+        </w:tc>
+      </w:tr>
+      <w:tr>
+        <w:tc>
+          <w:tcPr>
+            <w:tcW w:type="dxa" w:w="4320"/>
+          </w:tcPr>
+          <w:p>
+            <w:r/>
+            <w:r>
+              <w:rPr>
+                <w:b w:val="0"/>
+              </w:rPr>
+              <w:t>Fusion</w:t>
+            </w:r>
+          </w:p>
+        </w:tc>
+        <w:tc>
+          <w:tcPr>
+            <w:tcW w:type="dxa" w:w="4320"/>
+          </w:tcPr>
+          <w:p>
+            <w:pPr>
+              <w:jc w:val="center"/>
+            </w:pPr>
+            <w:r/>
+            <w:r>
+              <w:rPr>
+                <w:b w:val="0"/>
+              </w:rPr>
+              <w:t>0.997</w:t>
+            </w:r>
+          </w:p>
+        </w:tc>
+      </w:tr>
+      <w:tr>
+        <w:tc>
+          <w:tcPr>
+            <w:tcW w:type="dxa" w:w="4320"/>
+          </w:tcPr>
+          <w:p>
+            <w:r/>
+            <w:r>
+              <w:rPr>
+                <w:b w:val="0"/>
+              </w:rPr>
+              <w:t>Sound only</w:t>
+            </w:r>
+          </w:p>
+        </w:tc>
+        <w:tc>
+          <w:tcPr>
+            <w:tcW w:type="dxa" w:w="4320"/>
+          </w:tcPr>
+          <w:p>
+            <w:pPr>
+              <w:jc w:val="center"/>
+            </w:pPr>
+            <w:r/>
+            <w:r>
+              <w:rPr>
+                <w:b w:val="0"/>
+              </w:rPr>
+              <w:t>0.999</w:t>
+            </w:r>
+          </w:p>
+        </w:tc>
+      </w:tr>
+      <w:tr>
+        <w:tc>
+          <w:tcPr>
+            <w:tcW w:type="dxa" w:w="4320"/>
+          </w:tcPr>
+          <w:p>
+            <w:r/>
+            <w:r>
+              <w:rPr>
+                <w:b w:val="0"/>
+              </w:rPr>
+              <w:t>Hybrid</w:t>
+            </w:r>
+          </w:p>
+        </w:tc>
+        <w:tc>
+          <w:tcPr>
+            <w:tcW w:type="dxa" w:w="4320"/>
+          </w:tcPr>
+          <w:p>
+            <w:pPr>
+              <w:jc w:val="center"/>
+            </w:pPr>
+            <w:r/>
+            <w:r>
+              <w:rPr>
+                <w:b w:val="0"/>
+              </w:rPr>
+              <w:t>1.000</w:t>
+            </w:r>
+          </w:p>
+        </w:tc>
+      </w:tr>
+      <w:tr>
+        <w:tc>
+          <w:tcPr>
+            <w:tcW w:type="dxa" w:w="4320"/>
+          </w:tcPr>
+          <w:p>
+            <w:r/>
+            <w:r>
+              <w:rPr>
+                <w:b w:val="0"/>
+              </w:rPr>
+              <w:t>Early fusion</w:t>
+            </w:r>
+          </w:p>
+        </w:tc>
+        <w:tc>
+          <w:tcPr>
+            <w:tcW w:type="dxa" w:w="4320"/>
+          </w:tcPr>
+          <w:p>
+            <w:pPr>
+              <w:jc w:val="center"/>
+            </w:pPr>
+            <w:r/>
+            <w:r>
+              <w:rPr>
+                <w:b w:val="0"/>
+              </w:rPr>
+              <w:t>1.000</w:t>
+            </w:r>
+          </w:p>
+        </w:tc>
+      </w:tr>
+    </w:tbl>
+    <w:p/>
+    <w:p>
+      <w:pPr>
+        <w:spacing w:after="140"/>
+      </w:pPr>
+      <w:r>
+        <w:rPr>
+          <w:b w:val="0"/>
+          <w:i w:val="0"/>
+        </w:rPr>
+        <w:t>Every model reaches essentially 100%. The same early-fusion model scores 1.00 here and 0.70 with held-out recordings, which shows the protocol matters more than the architecture.</w:t>
+      </w:r>
+    </w:p>
+    <w:p>
+      <w:pPr>
+        <w:pStyle w:val="Heading2"/>
+      </w:pPr>
+      <w:r>
+        <w:t>6.5 Predicting the aperture as a number</w:t>
+      </w:r>
+    </w:p>
+    <w:p>
+      <w:pPr>
+        <w:spacing w:after="80"/>
+      </w:pPr>
+      <w:r>
+        <w:rPr>
+          <w:b w:val="0"/>
+          <w:i w:val="0"/>
+        </w:rPr>
+        <w:t>Instead of six classes the model predicts the opening directly (nominal counted as 100%):</w:t>
+      </w:r>
+    </w:p>
+    <w:tbl>
+      <w:tblPr>
+        <w:tblStyle w:val="LightGrid-Accent1"/>
+        <w:tblW w:type="auto" w:w="0"/>
+        <w:tblLook w:firstColumn="1" w:firstRow="1" w:lastColumn="0" w:lastRow="0" w:noHBand="0" w:noVBand="1" w:val="04A0"/>
+      </w:tblPr>
+      <w:tblGrid>
+        <w:gridCol w:w="2880"/>
+        <w:gridCol w:w="2880"/>
+        <w:gridCol w:w="2880"/>
+      </w:tblGrid>
+      <w:tr>
+        <w:tc>
+          <w:tcPr>
+            <w:tcW w:type="dxa" w:w="2880"/>
+          </w:tcPr>
+          <w:p>
+            <w:r/>
+            <w:r>
+              <w:rPr>
+                <w:b/>
+              </w:rPr>
+            </w:r>
+          </w:p>
+        </w:tc>
+        <w:tc>
+          <w:tcPr>
+            <w:tcW w:type="dxa" w:w="2880"/>
+          </w:tcPr>
+          <w:p>
+            <w:r/>
+            <w:r>
+              <w:rPr>
+                <w:b/>
+              </w:rPr>
+              <w:t>As 6 classes</w:t>
+            </w:r>
+          </w:p>
+        </w:tc>
+        <w:tc>
+          <w:tcPr>
+            <w:tcW w:type="dxa" w:w="2880"/>
+          </w:tcPr>
+          <w:p>
+            <w:r/>
+            <w:r>
+              <w:rPr>
+                <w:b/>
+              </w:rPr>
+              <w:t>As a number</w:t>
+            </w:r>
+          </w:p>
+        </w:tc>
+      </w:tr>
+      <w:tr>
+        <w:tc>
+          <w:tcPr>
+            <w:tcW w:type="dxa" w:w="2880"/>
+          </w:tcPr>
+          <w:p>
+            <w:r/>
+            <w:r>
+              <w:rPr>
+                <w:b w:val="0"/>
+              </w:rPr>
+              <w:t>6 apertures</w:t>
+            </w:r>
+          </w:p>
+        </w:tc>
+        <w:tc>
+          <w:tcPr>
+            <w:tcW w:type="dxa" w:w="2880"/>
+          </w:tcPr>
+          <w:p>
+            <w:pPr>
+              <w:jc w:val="center"/>
+            </w:pPr>
+            <w:r/>
+            <w:r>
+              <w:rPr>
+                <w:b/>
+              </w:rPr>
+              <w:t>0.84</w:t>
+            </w:r>
+          </w:p>
+        </w:tc>
+        <w:tc>
+          <w:tcPr>
+            <w:tcW w:type="dxa" w:w="2880"/>
+          </w:tcPr>
+          <w:p>
+            <w:pPr>
+              <w:jc w:val="center"/>
+            </w:pPr>
+            <w:r/>
+            <w:r>
+              <w:rPr>
+                <w:b w:val="0"/>
+              </w:rPr>
+              <w:t>0.79</w:t>
+            </w:r>
+          </w:p>
+        </w:tc>
+      </w:tr>
+      <w:tr>
+        <w:tc>
+          <w:tcPr>
+            <w:tcW w:type="dxa" w:w="2880"/>
+          </w:tcPr>
+          <w:p>
+            <w:r/>
+            <w:r>
+              <w:rPr>
+                <w:b w:val="0"/>
+              </w:rPr>
+              <w:t>Average error</w:t>
+            </w:r>
+          </w:p>
+        </w:tc>
+        <w:tc>
+          <w:tcPr>
+            <w:tcW w:type="dxa" w:w="2880"/>
+          </w:tcPr>
+          <w:p>
+            <w:pPr>
+              <w:jc w:val="center"/>
+            </w:pPr>
+            <w:r/>
+            <w:r>
+              <w:rPr>
+                <w:b w:val="0"/>
+              </w:rPr>
+              <w:t>-</w:t>
+            </w:r>
+          </w:p>
+        </w:tc>
+        <w:tc>
+          <w:tcPr>
+            <w:tcW w:type="dxa" w:w="2880"/>
+          </w:tcPr>
+          <w:p>
+            <w:pPr>
+              <w:jc w:val="center"/>
+            </w:pPr>
+            <w:r/>
+            <w:r>
+              <w:rPr>
+                <w:b/>
+              </w:rPr>
+              <w:t>3.8 aperture points</w:t>
+            </w:r>
+          </w:p>
+        </w:tc>
+      </w:tr>
+      <w:tr>
+        <w:tc>
+          <w:tcPr>
+            <w:tcW w:type="dxa" w:w="2880"/>
+          </w:tcPr>
+          <w:p>
+            <w:r/>
+            <w:r>
+              <w:rPr>
+                <w:b w:val="0"/>
+              </w:rPr>
+              <w:t>Cavitation</w:t>
+            </w:r>
+          </w:p>
+        </w:tc>
+        <w:tc>
+          <w:tcPr>
+            <w:tcW w:type="dxa" w:w="2880"/>
+          </w:tcPr>
+          <w:p>
+            <w:pPr>
+              <w:jc w:val="center"/>
+            </w:pPr>
+            <w:r/>
+            <w:r>
+              <w:rPr>
+                <w:b w:val="0"/>
+              </w:rPr>
+              <w:t>1.00</w:t>
+            </w:r>
+          </w:p>
+        </w:tc>
+        <w:tc>
+          <w:tcPr>
+            <w:tcW w:type="dxa" w:w="2880"/>
+          </w:tcPr>
+          <w:p>
+            <w:pPr>
+              <w:jc w:val="center"/>
+            </w:pPr>
+            <w:r/>
+            <w:r>
+              <w:rPr>
+                <w:b w:val="0"/>
+              </w:rPr>
+              <w:t>1.00 (no window wrong)</w:t>
+            </w:r>
+          </w:p>
+        </w:tc>
+      </w:tr>
+    </w:tbl>
+    <w:p/>
+    <w:p>
+      <w:pPr>
+        <w:spacing w:after="140"/>
+      </w:pPr>
+      <w:r>
+        <w:rPr>
+          <w:b w:val="0"/>
+          <w:i w:val="0"/>
+        </w:rPr>
+        <w:t>33 of 43 recordings land within 5 points of the true opening. This version handles the 20% setting perfectly (4/4 against 3/4), but underestimates the fully open recordings, which it predicts around 82-88 instead of 100, so they snap down to 75. Predictions are pulled towards the middle of the range, which costs accuracy at the ends. The two views are complementary, and the average error is the more informative number.</w:t>
+      </w:r>
+    </w:p>
+    <w:p>
+      <w:pPr>
+        <w:pStyle w:val="Heading2"/>
+      </w:pPr>
+      <w:r>
+        <w:t>6.6 Keeping clean and noisy separate</w:t>
       </w:r>
     </w:p>
     <w:tbl>
@@ -674,6 +2263,9 @@
           <w:p>
             <w:r/>
             <w:r>
+              <w:rPr>
+                <w:b w:val="0"/>
+              </w:rPr>
               <w:t>6 apertures</w:t>
             </w:r>
           </w:p>
@@ -688,6 +2280,9 @@
             </w:pPr>
             <w:r/>
             <w:r>
+              <w:rPr>
+                <w:b w:val="0"/>
+              </w:rPr>
               <w:t>0.74 (32/43)</w:t>
             </w:r>
           </w:p>
@@ -718,6 +2313,9 @@
           <w:p>
             <w:r/>
             <w:r>
+              <w:rPr>
+                <w:b w:val="0"/>
+              </w:rPr>
               <w:t>3 levels</w:t>
             </w:r>
           </w:p>
@@ -732,7 +2330,10 @@
             </w:pPr>
             <w:r/>
             <w:r>
-              <w:t>0.95 (41/43)</w:t>
+              <w:rPr>
+                <w:b w:val="0"/>
+              </w:rPr>
+              <w:t>0.95</w:t>
             </w:r>
           </w:p>
         </w:tc>
@@ -749,7 +2350,7 @@
               <w:rPr>
                 <w:b/>
               </w:rPr>
-              <w:t>1.00 (43/43)</w:t>
+              <w:t>1.00</w:t>
             </w:r>
           </w:p>
         </w:tc>
@@ -762,7 +2363,10 @@
           <w:p>
             <w:r/>
             <w:r>
-              <w:t>Cavitation vs. no cavitation</w:t>
+              <w:rPr>
+                <w:b w:val="0"/>
+              </w:rPr>
+              <w:t>Cavitation</w:t>
             </w:r>
           </w:p>
         </w:tc>
@@ -776,6 +2380,9 @@
             </w:pPr>
             <w:r/>
             <w:r>
+              <w:rPr>
+                <w:b w:val="0"/>
+              </w:rPr>
               <w:t>1.00</w:t>
             </w:r>
           </w:p>
@@ -790,6 +2397,9 @@
             </w:pPr>
             <w:r/>
             <w:r>
+              <w:rPr>
+                <w:b w:val="0"/>
+              </w:rPr>
               <w:t>1.00</w:t>
             </w:r>
           </w:p>
@@ -799,26 +2409,14 @@
     <w:p/>
     <w:p>
       <w:pPr>
-        <w:spacing w:after="160"/>
+        <w:spacing w:after="140"/>
       </w:pPr>
       <w:r>
         <w:rPr>
           <w:b w:val="0"/>
           <w:i w:val="0"/>
         </w:rPr>
-        <w:t>The gain comes mainly from the classes with few recordings: 20% and 15% improve from 3/8 to 5/8 correct, because pooling gives each of them 4 recordings instead of 2.</w:t>
-      </w:r>
-    </w:p>
-    <w:p>
-      <w:pPr>
-        <w:spacing w:after="160"/>
-      </w:pPr>
-      <w:r>
-        <w:rPr>
-          <w:b w:val="0"/>
-          <w:i w:val="0"/>
-        </w:rPr>
-        <w:t>The two are not exactly comparable: the pooled run used 4 folds (training on about 32 recordings) while the separate runs held out one recording at a time (training on 22 and 19), so part of the gain is simply more training data.</w:t>
+        <w:t>Pooling helps mainly the two settings with few recordings: 20% and 15% improve from 3/8 to 5/8, because each then has 4 recordings instead of 2. Part of the gain is simply more training data, since the pooled run trains on about 32 recordings per fold against 22 and 19 for the separate ones.</w:t>
       </w:r>
     </w:p>
     <w:p>
@@ -826,31 +2424,7 @@
         <w:pStyle w:val="Heading1"/>
       </w:pPr>
       <w:r>
-        <w:t>Supplementary: predicting the aperture as a number</w:t>
-      </w:r>
-    </w:p>
-    <w:p>
-      <w:pPr>
-        <w:spacing w:after="160"/>
-      </w:pPr>
-      <w:r>
-        <w:rPr>
-          <w:b w:val="0"/>
-          <w:i w:val="0"/>
-        </w:rPr>
-        <w:t>Following your suggestion I also tried predicting the aperture as a continuous value rather than choosing one of 6 classes. Being a few points off then counts as a small error instead of a wrong class, which suits the settings that sit close together.</w:t>
-      </w:r>
-    </w:p>
-    <w:p>
-      <w:pPr>
-        <w:spacing w:after="160"/>
-      </w:pPr>
-      <w:r>
-        <w:rPr>
-          <w:b w:val="0"/>
-          <w:i w:val="0"/>
-        </w:rPr>
-        <w:t>Run on the pooled recordings with 4 folds:</w:t>
+        <w:t>7. Things that were tried and did not help</w:t>
       </w:r>
     </w:p>
     <w:tbl>
@@ -860,14 +2434,13 @@
         <w:tblLook w:firstColumn="1" w:firstRow="1" w:lastColumn="0" w:lastRow="0" w:noHBand="0" w:noVBand="1" w:val="04A0"/>
       </w:tblPr>
       <w:tblGrid>
-        <w:gridCol w:w="2880"/>
-        <w:gridCol w:w="2880"/>
-        <w:gridCol w:w="2880"/>
+        <w:gridCol w:w="4320"/>
+        <w:gridCol w:w="4320"/>
       </w:tblGrid>
       <w:tr>
         <w:tc>
           <w:tcPr>
-            <w:tcW w:type="dxa" w:w="2880"/>
+            <w:tcW w:type="dxa" w:w="4320"/>
           </w:tcPr>
           <w:p>
             <w:r/>
@@ -875,12 +2448,13 @@
               <w:rPr>
                 <w:b/>
               </w:rPr>
+              <w:t>Idea</w:t>
             </w:r>
           </w:p>
         </w:tc>
         <w:tc>
           <w:tcPr>
-            <w:tcW w:type="dxa" w:w="2880"/>
+            <w:tcW w:type="dxa" w:w="4320"/>
           </w:tcPr>
           <w:p>
             <w:r/>
@@ -888,21 +2462,7 @@
               <w:rPr>
                 <w:b/>
               </w:rPr>
-              <w:t>As 6 classes</w:t>
-            </w:r>
-          </w:p>
-        </w:tc>
-        <w:tc>
-          <w:tcPr>
-            <w:tcW w:type="dxa" w:w="2880"/>
-          </w:tcPr>
-          <w:p>
-            <w:r/>
-            <w:r>
-              <w:rPr>
-                <w:b/>
-              </w:rPr>
-              <w:t>As a number</w:t>
+              <w:t>Result</w:t>
             </w:r>
           </w:p>
         </w:tc>
@@ -910,18 +2470,21 @@
       <w:tr>
         <w:tc>
           <w:tcPr>
-            <w:tcW w:type="dxa" w:w="2880"/>
+            <w:tcW w:type="dxa" w:w="4320"/>
           </w:tcPr>
           <w:p>
             <w:r/>
             <w:r>
-              <w:t>6 apertures</w:t>
+              <w:rPr>
+                <w:b w:val="0"/>
+              </w:rPr>
+              <w:t>Augmentation (time shift, volume, noise)</w:t>
             </w:r>
           </w:p>
         </w:tc>
         <w:tc>
           <w:tcPr>
-            <w:tcW w:type="dxa" w:w="2880"/>
+            <w:tcW w:type="dxa" w:w="4320"/>
           </w:tcPr>
           <w:p>
             <w:pPr>
@@ -930,23 +2493,9 @@
             <w:r/>
             <w:r>
               <w:rPr>
-                <w:b/>
+                <w:b w:val="0"/>
               </w:rPr>
-              <w:t>0.84 (36/43)</w:t>
-            </w:r>
-          </w:p>
-        </w:tc>
-        <w:tc>
-          <w:tcPr>
-            <w:tcW w:type="dxa" w:w="2880"/>
-          </w:tcPr>
-          <w:p>
-            <w:pPr>
-              <w:jc w:val="center"/>
-            </w:pPr>
-            <w:r/>
-            <w:r>
-              <w:t>0.79 (34/43)</w:t>
+              <w:t>No improvement. It varies the recordings already available and cannot add new operating points.</w:t>
             </w:r>
           </w:p>
         </w:tc>
@@ -954,73 +2503,21 @@
       <w:tr>
         <w:tc>
           <w:tcPr>
-            <w:tcW w:type="dxa" w:w="2880"/>
+            <w:tcW w:type="dxa" w:w="4320"/>
           </w:tcPr>
           <w:p>
             <w:r/>
             <w:r>
-              <w:t>Cavitation vs. no cavitation</w:t>
+              <w:rPr>
+                <w:b w:val="0"/>
+              </w:rPr>
+              <w:t>Larger spectrograms (128x128)</w:t>
             </w:r>
           </w:p>
         </w:tc>
         <w:tc>
           <w:tcPr>
-            <w:tcW w:type="dxa" w:w="2880"/>
-          </w:tcPr>
-          <w:p>
-            <w:pPr>
-              <w:jc w:val="center"/>
-            </w:pPr>
-            <w:r/>
-            <w:r>
-              <w:t>1.00</w:t>
-            </w:r>
-          </w:p>
-        </w:tc>
-        <w:tc>
-          <w:tcPr>
-            <w:tcW w:type="dxa" w:w="2880"/>
-          </w:tcPr>
-          <w:p>
-            <w:pPr>
-              <w:jc w:val="center"/>
-            </w:pPr>
-            <w:r/>
-            <w:r>
-              <w:t>1.00 (no window wrong)</w:t>
-            </w:r>
-          </w:p>
-        </w:tc>
-      </w:tr>
-      <w:tr>
-        <w:tc>
-          <w:tcPr>
-            <w:tcW w:type="dxa" w:w="2880"/>
-          </w:tcPr>
-          <w:p>
-            <w:r/>
-            <w:r>
-              <w:t>Average error</w:t>
-            </w:r>
-          </w:p>
-        </w:tc>
-        <w:tc>
-          <w:tcPr>
-            <w:tcW w:type="dxa" w:w="2880"/>
-          </w:tcPr>
-          <w:p>
-            <w:pPr>
-              <w:jc w:val="center"/>
-            </w:pPr>
-            <w:r/>
-            <w:r>
-              <w:t>-</w:t>
-            </w:r>
-          </w:p>
-        </w:tc>
-        <w:tc>
-          <w:tcPr>
-            <w:tcW w:type="dxa" w:w="2880"/>
+            <w:tcW w:type="dxa" w:w="4320"/>
           </w:tcPr>
           <w:p>
             <w:pPr>
@@ -1029,9 +2526,141 @@
             <w:r/>
             <w:r>
               <w:rPr>
-                <w:b/>
+                <w:b w:val="0"/>
               </w:rPr>
-              <w:t>3.8 aperture points</w:t>
+              <w:t>0.70 against 0.70 for 64x64. No gain, twice the compute.</w:t>
+            </w:r>
+          </w:p>
+        </w:tc>
+      </w:tr>
+      <w:tr>
+        <w:tc>
+          <w:tcPr>
+            <w:tcW w:type="dxa" w:w="4320"/>
+          </w:tcPr>
+          <w:p>
+            <w:r/>
+            <w:r>
+              <w:rPr>
+                <w:b w:val="0"/>
+              </w:rPr>
+              <w:t>Soft voting instead of majority</w:t>
+            </w:r>
+          </w:p>
+        </w:tc>
+        <w:tc>
+          <w:tcPr>
+            <w:tcW w:type="dxa" w:w="4320"/>
+          </w:tcPr>
+          <w:p>
+            <w:pPr>
+              <w:jc w:val="center"/>
+            </w:pPr>
+            <w:r/>
+            <w:r>
+              <w:rPr>
+                <w:b w:val="0"/>
+              </w:rPr>
+              <w:t>Identical result on every run.</w:t>
+            </w:r>
+          </w:p>
+        </w:tc>
+      </w:tr>
+      <w:tr>
+        <w:tc>
+          <w:tcPr>
+            <w:tcW w:type="dxa" w:w="4320"/>
+          </w:tcPr>
+          <w:p>
+            <w:r/>
+            <w:r>
+              <w:rPr>
+                <w:b w:val="0"/>
+              </w:rPr>
+              <w:t>AdamW and cosine schedule</w:t>
+            </w:r>
+          </w:p>
+        </w:tc>
+        <w:tc>
+          <w:tcPr>
+            <w:tcW w:type="dxa" w:w="4320"/>
+          </w:tcPr>
+          <w:p>
+            <w:pPr>
+              <w:jc w:val="center"/>
+            </w:pPr>
+            <w:r/>
+            <w:r>
+              <w:rPr>
+                <w:b w:val="0"/>
+              </w:rPr>
+              <w:t>No change to the 6-aperture result, kept as reasonable regularisation.</w:t>
+            </w:r>
+          </w:p>
+        </w:tc>
+      </w:tr>
+      <w:tr>
+        <w:tc>
+          <w:tcPr>
+            <w:tcW w:type="dxa" w:w="4320"/>
+          </w:tcPr>
+          <w:p>
+            <w:r/>
+            <w:r>
+              <w:rPr>
+                <w:b w:val="0"/>
+              </w:rPr>
+              <w:t>Gated fusion</w:t>
+            </w:r>
+          </w:p>
+        </w:tc>
+        <w:tc>
+          <w:tcPr>
+            <w:tcW w:type="dxa" w:w="4320"/>
+          </w:tcPr>
+          <w:p>
+            <w:pPr>
+              <w:jc w:val="center"/>
+            </w:pPr>
+            <w:r/>
+            <w:r>
+              <w:rPr>
+                <w:b w:val="0"/>
+              </w:rPr>
+              <w:t>No better than plain fusion. The gate cannot learn to distrust a sensor, because on the training data both look reliable.</w:t>
+            </w:r>
+          </w:p>
+        </w:tc>
+      </w:tr>
+      <w:tr>
+        <w:tc>
+          <w:tcPr>
+            <w:tcW w:type="dxa" w:w="4320"/>
+          </w:tcPr>
+          <w:p>
+            <w:r/>
+            <w:r>
+              <w:rPr>
+                <w:b w:val="0"/>
+              </w:rPr>
+              <w:t>Hand-crafted descriptors (hybrid)</w:t>
+            </w:r>
+          </w:p>
+        </w:tc>
+        <w:tc>
+          <w:tcPr>
+            <w:tcW w:type="dxa" w:w="4320"/>
+          </w:tcPr>
+          <w:p>
+            <w:pPr>
+              <w:jc w:val="center"/>
+            </w:pPr>
+            <w:r/>
+            <w:r>
+              <w:rPr>
+                <w:b w:val="0"/>
+              </w:rPr>
+              <w:t>0.74, below early fusion.</w:t>
             </w:r>
           </w:p>
         </w:tc>
@@ -1040,26 +2669,14 @@
     <w:p/>
     <w:p>
       <w:pPr>
-        <w:spacing w:after="160"/>
+        <w:spacing w:after="140"/>
       </w:pPr>
       <w:r>
         <w:rPr>
           <w:b w:val="0"/>
           <w:i w:val="0"/>
         </w:rPr>
-        <w:t>The model predicts the valve opening to within 3.8 points on average, and 33 of the 43 recordings fall within 5 points.</w:t>
-      </w:r>
-    </w:p>
-    <w:p>
-      <w:pPr>
-        <w:spacing w:after="160"/>
-      </w:pPr>
-      <w:r>
-        <w:rPr>
-          <w:b w:val="0"/>
-          <w:i w:val="0"/>
-        </w:rPr>
-        <w:t>It fixed the 20% setting completely (4/4 against 3/4), but lost ground at nominal and 75%: for fully open recordings it predicts around 82 to 88 instead of 100, so those snap down to 75. Predictions are pulled towards the middle of the range, which costs accuracy at the ends. The two views are therefore complementary, and the average error is the more informative number of the two.</w:t>
+        <w:t>Together these show the limit is the amount of data, not the training recipe: five different changes to the model or optimisation left the result unchanged, while adding recordings (pooling) moved it by 10 points.</w:t>
       </w:r>
     </w:p>
     <w:p>
@@ -1067,7 +2684,19 @@
         <w:pStyle w:val="Heading1"/>
       </w:pPr>
       <w:r>
-        <w:t>Limitations</w:t>
+        <w:t>8. Where the errors are</w:t>
+      </w:r>
+    </w:p>
+    <w:p>
+      <w:pPr>
+        <w:spacing w:after="140"/>
+      </w:pPr>
+      <w:r>
+        <w:rPr>
+          <w:b w:val="0"/>
+          <w:i w:val="0"/>
+        </w:rPr>
+        <w:t>Every mistake is between neighbouring settings:</w:t>
       </w:r>
     </w:p>
     <w:p>
@@ -1075,7 +2704,7 @@
         <w:pStyle w:val="ListBullet"/>
       </w:pPr>
       <w:r>
-        <w:t>20% and 15% have only 2 recordings each per condition, so holding one out leaves a single training example. Their individual accuracy is therefore unreliable, although they are reliable when reported together as one level.</w:t>
+        <w:t>nominal and 75% - neither has cavitation and they differ only in flow rate.</w:t>
       </w:r>
     </w:p>
     <w:p>
@@ -1083,7 +2712,27 @@
         <w:pStyle w:val="ListBullet"/>
       </w:pPr>
       <w:r>
-        <w:t>nominal and 75% look almost identical in the signals, which is consistent with cavitation not being present at those settings.</w:t>
+        <w:t>20% and 15% - both in the developing region, and each has only 2 recordings.</w:t>
+      </w:r>
+    </w:p>
+    <w:p>
+      <w:pPr>
+        <w:spacing w:after="140"/>
+      </w:pPr>
+      <w:r>
+        <w:rPr>
+          <w:b w:val="0"/>
+          <w:i w:val="0"/>
+        </w:rPr>
+        <w:t>No recording with cavitation was ever labelled as no cavitation, in any condition or any model. The mistakes are therefore always one step off, never a missed detection.</w:t>
+      </w:r>
+    </w:p>
+    <w:p>
+      <w:pPr>
+        <w:pStyle w:val="Heading1"/>
+      </w:pPr>
+      <w:r>
+        <w:t>9. Limitations</w:t>
       </w:r>
     </w:p>
     <w:p>
@@ -1091,7 +2740,31 @@
         <w:pStyle w:val="ListBullet"/>
       </w:pPr>
       <w:r>
-        <w:t>Augmentation, larger spectrograms, and different training settings were all tested and none improved the 6-aperture result, which suggests the limit is the amount of data rather than the model.</w:t>
+        <w:t>20% and 15% have 2 recordings each per condition. Holding one out leaves a single example to learn from, and the two are recorded at different microphone distances, so the model must generalise across distance from one example. Their individual results are not reliable; they are reliable when reported together as one level.</w:t>
+      </w:r>
+    </w:p>
+    <w:p>
+      <w:pPr>
+        <w:pStyle w:val="ListBullet"/>
+      </w:pPr>
+      <w:r>
+        <w:t>nominal and 75% are physically very close. With no cavitation at either setting, the difference is flow rate only, so some confusion is expected regardless of the model.</w:t>
+      </w:r>
+    </w:p>
+    <w:p>
+      <w:pPr>
+        <w:pStyle w:val="ListBullet"/>
+      </w:pPr>
+      <w:r>
+        <w:t>One session, one pump. All recordings come from a single day, so the results say nothing about a different pump or a different installation.</w:t>
+      </w:r>
+    </w:p>
+    <w:p>
+      <w:pPr>
+        <w:pStyle w:val="ListBullet"/>
+      </w:pPr>
+      <w:r>
+        <w:t>The exact numbers are strict. They come from testing on recordings never seen during training. The same models reach 100% when windows are shuffled instead.</w:t>
       </w:r>
     </w:p>
     <w:p>
@@ -1099,7 +2772,55 @@
         <w:pStyle w:val="Heading1"/>
       </w:pPr>
       <w:r>
-        <w:t>Possible next steps</w:t>
+        <w:t>10. Conclusions</w:t>
+      </w:r>
+    </w:p>
+    <w:p>
+      <w:pPr>
+        <w:pStyle w:val="ListNumber"/>
+      </w:pPr>
+      <w:r>
+        <w:t>Cavitation detection is solved on this data. Every model, including the cheap time-domain one, separates cavitation from no cavitation perfectly on unseen recordings, in both clean and noisy conditions.</w:t>
+      </w:r>
+    </w:p>
+    <w:p>
+      <w:pPr>
+        <w:pStyle w:val="ListNumber"/>
+      </w:pPr>
+      <w:r>
+        <w:t>Early fusion is the best of the models tried for the exact aperture: 0.84 pooled, with less than half the parameters of the hybrid.</w:t>
+      </w:r>
+    </w:p>
+    <w:p>
+      <w:pPr>
+        <w:pStyle w:val="ListNumber"/>
+      </w:pPr>
+      <w:r>
+        <w:t>The evaluation protocol dominates the result. The same model scores 1.00 with shuffled windows and 0.70 to 0.84 with held-out recordings.</w:t>
+      </w:r>
+    </w:p>
+    <w:p>
+      <w:pPr>
+        <w:pStyle w:val="ListNumber"/>
+      </w:pPr>
+      <w:r>
+        <w:t>The remaining errors are physical or data-related, not modelling failures: adjacent settings and the two classes with two recordings.</w:t>
+      </w:r>
+    </w:p>
+    <w:p>
+      <w:pPr>
+        <w:pStyle w:val="ListNumber"/>
+      </w:pPr>
+      <w:r>
+        <w:t>For a low-end device, the time-frequency transform is not needed if the goal is cavitation detection; it only helps for the exact aperture.</w:t>
+      </w:r>
+    </w:p>
+    <w:p>
+      <w:pPr>
+        <w:pStyle w:val="Heading1"/>
+      </w:pPr>
+      <w:r>
+        <w:t>11. Possible next steps</w:t>
       </w:r>
     </w:p>
     <w:p>
@@ -1107,7 +2828,7 @@
         <w:pStyle w:val="ListBullet"/>
       </w:pPr>
       <w:r>
-        <w:t>More recordings of 20% and 15% would be the most useful addition.</w:t>
+        <w:t>More recordings of 20% and 15%, which is the only change likely to lift the exact-aperture result.</w:t>
       </w:r>
     </w:p>
     <w:p>
@@ -1115,7 +2836,7 @@
         <w:pStyle w:val="ListBullet"/>
       </w:pPr>
       <w:r>
-        <w:t>Predicting severity as a continuous value instead of 6 separate classes.</w:t>
+        <w:t>Reporting the aperture as a continuous value, which suits the settings that sit close together and gives an error of about 4 points.</w:t>
       </w:r>
     </w:p>
     <w:p>
@@ -1123,7 +2844,15 @@
         <w:pStyle w:val="ListBullet"/>
       </w:pPr>
       <w:r>
-        <w:t>Two-stage classification (first the level, then the aperture within it) and self-supervised pretraining.</w:t>
+        <w:t>Running the time-domain model on the device, since it needs no transform and detects cavitation just as well.</w:t>
+      </w:r>
+    </w:p>
+    <w:p>
+      <w:pPr>
+        <w:pStyle w:val="ListBullet"/>
+      </w:pPr>
+      <w:r>
+        <w:t>Two-stage classification (first the level, then the setting within it) and self-supervised pretraining, if more data becomes available.</w:t>
       </w:r>
     </w:p>
     <w:sectPr>
@@ -1501,7 +3230,7 @@
     <w:rsid w:val="00FC693F"/>
     <w:rPr>
       <w:rFonts w:ascii="Calibri" w:hAnsi="Calibri"/>
-      <w:sz w:val="22"/>
+      <w:sz w:val="21"/>
     </w:rPr>
   </w:style>
   <w:style w:type="paragraph" w:styleId="Header">

</xml_diff>

<commit_message>
add sound-only comparison, update report
</commit_message>
<xml_diff>
--- a/REPORT.docx
+++ b/REPORT.docx
@@ -1229,16 +1229,17 @@
         <w:tblLook w:firstColumn="1" w:firstRow="1" w:lastColumn="0" w:lastRow="0" w:noHBand="0" w:noVBand="1" w:val="04A0"/>
       </w:tblPr>
       <w:tblGrid>
-        <w:gridCol w:w="1728"/>
-        <w:gridCol w:w="1728"/>
-        <w:gridCol w:w="1728"/>
-        <w:gridCol w:w="1728"/>
-        <w:gridCol w:w="1728"/>
+        <w:gridCol w:w="1440"/>
+        <w:gridCol w:w="1440"/>
+        <w:gridCol w:w="1440"/>
+        <w:gridCol w:w="1440"/>
+        <w:gridCol w:w="1440"/>
+        <w:gridCol w:w="1440"/>
       </w:tblGrid>
       <w:tr>
         <w:tc>
           <w:tcPr>
-            <w:tcW w:type="dxa" w:w="1728"/>
+            <w:tcW w:type="dxa" w:w="1440"/>
           </w:tcPr>
           <w:p>
             <w:r/>
@@ -1252,7 +1253,21 @@
         </w:tc>
         <w:tc>
           <w:tcPr>
-            <w:tcW w:type="dxa" w:w="1728"/>
+            <w:tcW w:type="dxa" w:w="1440"/>
+          </w:tcPr>
+          <w:p>
+            <w:r/>
+            <w:r>
+              <w:rPr>
+                <w:b/>
+              </w:rPr>
+              <w:t>Sensors</w:t>
+            </w:r>
+          </w:p>
+        </w:tc>
+        <w:tc>
+          <w:tcPr>
+            <w:tcW w:type="dxa" w:w="1440"/>
           </w:tcPr>
           <w:p>
             <w:r/>
@@ -1266,7 +1281,7 @@
         </w:tc>
         <w:tc>
           <w:tcPr>
-            <w:tcW w:type="dxa" w:w="1728"/>
+            <w:tcW w:type="dxa" w:w="1440"/>
           </w:tcPr>
           <w:p>
             <w:r/>
@@ -1280,7 +1295,7 @@
         </w:tc>
         <w:tc>
           <w:tcPr>
-            <w:tcW w:type="dxa" w:w="1728"/>
+            <w:tcW w:type="dxa" w:w="1440"/>
           </w:tcPr>
           <w:p>
             <w:r/>
@@ -1294,7 +1309,7 @@
         </w:tc>
         <w:tc>
           <w:tcPr>
-            <w:tcW w:type="dxa" w:w="1728"/>
+            <w:tcW w:type="dxa" w:w="1440"/>
           </w:tcPr>
           <w:p>
             <w:r/>
@@ -1310,7 +1325,7 @@
       <w:tr>
         <w:tc>
           <w:tcPr>
-            <w:tcW w:type="dxa" w:w="1728"/>
+            <w:tcW w:type="dxa" w:w="1440"/>
           </w:tcPr>
           <w:p>
             <w:r/>
@@ -1324,7 +1339,24 @@
         </w:tc>
         <w:tc>
           <w:tcPr>
-            <w:tcW w:type="dxa" w:w="1728"/>
+            <w:tcW w:type="dxa" w:w="1440"/>
+          </w:tcPr>
+          <w:p>
+            <w:pPr>
+              <w:jc w:val="center"/>
+            </w:pPr>
+            <w:r/>
+            <w:r>
+              <w:rPr>
+                <w:b w:val="0"/>
+              </w:rPr>
+              <w:t>both</w:t>
+            </w:r>
+          </w:p>
+        </w:tc>
+        <w:tc>
+          <w:tcPr>
+            <w:tcW w:type="dxa" w:w="1440"/>
           </w:tcPr>
           <w:p>
             <w:pPr>
@@ -1341,7 +1373,7 @@
         </w:tc>
         <w:tc>
           <w:tcPr>
-            <w:tcW w:type="dxa" w:w="1728"/>
+            <w:tcW w:type="dxa" w:w="1440"/>
           </w:tcPr>
           <w:p>
             <w:pPr>
@@ -1358,7 +1390,7 @@
         </w:tc>
         <w:tc>
           <w:tcPr>
-            <w:tcW w:type="dxa" w:w="1728"/>
+            <w:tcW w:type="dxa" w:w="1440"/>
           </w:tcPr>
           <w:p>
             <w:pPr>
@@ -1375,7 +1407,7 @@
         </w:tc>
         <w:tc>
           <w:tcPr>
-            <w:tcW w:type="dxa" w:w="1728"/>
+            <w:tcW w:type="dxa" w:w="1440"/>
           </w:tcPr>
           <w:p>
             <w:pPr>
@@ -1394,7 +1426,7 @@
       <w:tr>
         <w:tc>
           <w:tcPr>
-            <w:tcW w:type="dxa" w:w="1728"/>
+            <w:tcW w:type="dxa" w:w="1440"/>
           </w:tcPr>
           <w:p>
             <w:r/>
@@ -1408,7 +1440,24 @@
         </w:tc>
         <w:tc>
           <w:tcPr>
-            <w:tcW w:type="dxa" w:w="1728"/>
+            <w:tcW w:type="dxa" w:w="1440"/>
+          </w:tcPr>
+          <w:p>
+            <w:pPr>
+              <w:jc w:val="center"/>
+            </w:pPr>
+            <w:r/>
+            <w:r>
+              <w:rPr>
+                <w:b w:val="0"/>
+              </w:rPr>
+              <w:t>both</w:t>
+            </w:r>
+          </w:p>
+        </w:tc>
+        <w:tc>
+          <w:tcPr>
+            <w:tcW w:type="dxa" w:w="1440"/>
           </w:tcPr>
           <w:p>
             <w:pPr>
@@ -1425,7 +1474,7 @@
         </w:tc>
         <w:tc>
           <w:tcPr>
-            <w:tcW w:type="dxa" w:w="1728"/>
+            <w:tcW w:type="dxa" w:w="1440"/>
           </w:tcPr>
           <w:p>
             <w:pPr>
@@ -1442,7 +1491,7 @@
         </w:tc>
         <w:tc>
           <w:tcPr>
-            <w:tcW w:type="dxa" w:w="1728"/>
+            <w:tcW w:type="dxa" w:w="1440"/>
           </w:tcPr>
           <w:p>
             <w:pPr>
@@ -1459,7 +1508,7 @@
         </w:tc>
         <w:tc>
           <w:tcPr>
-            <w:tcW w:type="dxa" w:w="1728"/>
+            <w:tcW w:type="dxa" w:w="1440"/>
           </w:tcPr>
           <w:p>
             <w:pPr>
@@ -1478,7 +1527,7 @@
       <w:tr>
         <w:tc>
           <w:tcPr>
-            <w:tcW w:type="dxa" w:w="1728"/>
+            <w:tcW w:type="dxa" w:w="1440"/>
           </w:tcPr>
           <w:p>
             <w:r/>
@@ -1486,13 +1535,30 @@
               <w:rPr>
                 <w:b w:val="0"/>
               </w:rPr>
-              <w:t>Fusion (intermediate)</w:t>
+              <w:t>Sound only</w:t>
             </w:r>
           </w:p>
         </w:tc>
         <w:tc>
           <w:tcPr>
-            <w:tcW w:type="dxa" w:w="1728"/>
+            <w:tcW w:type="dxa" w:w="1440"/>
+          </w:tcPr>
+          <w:p>
+            <w:pPr>
+              <w:jc w:val="center"/>
+            </w:pPr>
+            <w:r/>
+            <w:r>
+              <w:rPr>
+                <w:b w:val="0"/>
+              </w:rPr>
+              <w:t>one</w:t>
+            </w:r>
+          </w:p>
+        </w:tc>
+        <w:tc>
+          <w:tcPr>
+            <w:tcW w:type="dxa" w:w="1440"/>
           </w:tcPr>
           <w:p>
             <w:pPr>
@@ -1509,7 +1575,108 @@
         </w:tc>
         <w:tc>
           <w:tcPr>
-            <w:tcW w:type="dxa" w:w="1728"/>
+            <w:tcW w:type="dxa" w:w="1440"/>
+          </w:tcPr>
+          <w:p>
+            <w:pPr>
+              <w:jc w:val="center"/>
+            </w:pPr>
+            <w:r/>
+            <w:r>
+              <w:rPr>
+                <w:b w:val="0"/>
+              </w:rPr>
+              <w:t>0.77 (33/43)</w:t>
+            </w:r>
+          </w:p>
+        </w:tc>
+        <w:tc>
+          <w:tcPr>
+            <w:tcW w:type="dxa" w:w="1440"/>
+          </w:tcPr>
+          <w:p>
+            <w:pPr>
+              <w:jc w:val="center"/>
+            </w:pPr>
+            <w:r/>
+            <w:r>
+              <w:rPr>
+                <w:b w:val="0"/>
+              </w:rPr>
+              <w:t>0.98</w:t>
+            </w:r>
+          </w:p>
+        </w:tc>
+        <w:tc>
+          <w:tcPr>
+            <w:tcW w:type="dxa" w:w="1440"/>
+          </w:tcPr>
+          <w:p>
+            <w:pPr>
+              <w:jc w:val="center"/>
+            </w:pPr>
+            <w:r/>
+            <w:r>
+              <w:rPr>
+                <w:b w:val="0"/>
+              </w:rPr>
+              <w:t>1.00</w:t>
+            </w:r>
+          </w:p>
+        </w:tc>
+      </w:tr>
+      <w:tr>
+        <w:tc>
+          <w:tcPr>
+            <w:tcW w:type="dxa" w:w="1440"/>
+          </w:tcPr>
+          <w:p>
+            <w:r/>
+            <w:r>
+              <w:rPr>
+                <w:b w:val="0"/>
+              </w:rPr>
+              <w:t>Fusion (intermediate)</w:t>
+            </w:r>
+          </w:p>
+        </w:tc>
+        <w:tc>
+          <w:tcPr>
+            <w:tcW w:type="dxa" w:w="1440"/>
+          </w:tcPr>
+          <w:p>
+            <w:pPr>
+              <w:jc w:val="center"/>
+            </w:pPr>
+            <w:r/>
+            <w:r>
+              <w:rPr>
+                <w:b w:val="0"/>
+              </w:rPr>
+              <w:t>both</w:t>
+            </w:r>
+          </w:p>
+        </w:tc>
+        <w:tc>
+          <w:tcPr>
+            <w:tcW w:type="dxa" w:w="1440"/>
+          </w:tcPr>
+          <w:p>
+            <w:pPr>
+              <w:jc w:val="center"/>
+            </w:pPr>
+            <w:r/>
+            <w:r>
+              <w:rPr>
+                <w:b w:val="0"/>
+              </w:rPr>
+              <w:t>raw time domain</w:t>
+            </w:r>
+          </w:p>
+        </w:tc>
+        <w:tc>
+          <w:tcPr>
+            <w:tcW w:type="dxa" w:w="1440"/>
           </w:tcPr>
           <w:p>
             <w:pPr>
@@ -1526,7 +1693,7 @@
         </w:tc>
         <w:tc>
           <w:tcPr>
-            <w:tcW w:type="dxa" w:w="1728"/>
+            <w:tcW w:type="dxa" w:w="1440"/>
           </w:tcPr>
           <w:p>
             <w:pPr>
@@ -1543,7 +1710,7 @@
         </w:tc>
         <w:tc>
           <w:tcPr>
-            <w:tcW w:type="dxa" w:w="1728"/>
+            <w:tcW w:type="dxa" w:w="1440"/>
           </w:tcPr>
           <w:p>
             <w:pPr>
@@ -1570,7 +1737,19 @@
           <w:b w:val="0"/>
           <w:i w:val="0"/>
         </w:rPr>
-        <w:t>Earlier runs, before the seed was fixed and under other protocols, are consistent with this ordering: sound only 0.65, hybrid 0.74, spectral 0.61, gated fusion 0.70.</w:t>
+        <w:t>Using both sensors only helps if they are combined at the input. The intermediate fusion of the two raw signals (0.74) is in fact worse than the microphone alone (0.77), because the weaker vibration branch pulls the result down. Early fusion, where the two become one image before any processing, is the only version that beats the single sensor (0.84).</w:t>
+      </w:r>
+    </w:p>
+    <w:p>
+      <w:pPr>
+        <w:spacing w:after="140"/>
+      </w:pPr>
+      <w:r>
+        <w:rPr>
+          <w:b w:val="0"/>
+          <w:i w:val="0"/>
+        </w:rPr>
+        <w:t>Cavitation itself is detected perfectly by every model in the table, including the single microphone.</w:t>
       </w:r>
     </w:p>
     <w:p>
@@ -1759,6 +1938,18 @@
           <w:i w:val="0"/>
         </w:rPr>
         <w:t>The transform is worth about 9 points on the exact six settings, but nothing at all for detecting cavitation, where both reach 100%. So if the goal on the device is to answer "is the pump cavitating", the cheap time-domain model is enough and no transform is needed. The transform only pays off if the exact aperture is required.</w:t>
+      </w:r>
+    </w:p>
+    <w:p>
+      <w:pPr>
+        <w:spacing w:after="140"/>
+      </w:pPr>
+      <w:r>
+        <w:rPr>
+          <w:b w:val="0"/>
+          <w:i w:val="0"/>
+        </w:rPr>
+        <w:t>The same holds for the number of sensors: a single microphone processed in the time domain also detects cavitation without a single mistake. For that task the cheapest possible setup is sufficient, and the extra sensor and the transform only earn their cost when the exact setting is needed.</w:t>
       </w:r>
     </w:p>
     <w:p>
@@ -2796,6 +2987,14 @@
         <w:pStyle w:val="ListNumber"/>
       </w:pPr>
       <w:r>
+        <w:t>Using both sensors helps only if they are fused at the input. Combining the two raw signals in separate branches (0.74) is worse than the microphone alone (0.77); stacking them into one image first gives 0.84.</w:t>
+      </w:r>
+    </w:p>
+    <w:p>
+      <w:pPr>
+        <w:pStyle w:val="ListNumber"/>
+      </w:pPr>
+      <w:r>
         <w:t>The evaluation protocol dominates the result. The same model scores 1.00 with shuffled windows and 0.70 to 0.84 with held-out recordings.</w:t>
       </w:r>
     </w:p>

</xml_diff>

<commit_message>
tidy report: augmentation described in pipeline
</commit_message>
<xml_diff>
--- a/REPORT.docx
+++ b/REPORT.docx
@@ -683,6 +683,18 @@
           <w:i w:val="0"/>
         </w:rPr>
         <w:t>Step 2 - Windows. Each recording is cut into 1-second windows. Training uses 50% overlap; testing uses none. Per window and per channel the mean is removed (this takes out gravity on the accelerometer) while the amplitude is kept, because vibration level itself carries information. Microphone samples are scaled to roughly plus/minus 1.</w:t>
+      </w:r>
+    </w:p>
+    <w:p>
+      <w:pPr>
+        <w:spacing w:after="140"/>
+      </w:pPr>
+      <w:r>
+        <w:rPr>
+          <w:b w:val="0"/>
+          <w:i w:val="0"/>
+        </w:rPr>
+        <w:t>During training each window is also varied slightly (small time shift, small volume change, a little noise) so the model does not simply memorise the windows it has seen.</w:t>
       </w:r>
     </w:p>
     <w:p>
@@ -2669,39 +2681,6 @@
               <w:rPr>
                 <w:b w:val="0"/>
               </w:rPr>
-              <w:t>Augmentation (time shift, volume, noise)</w:t>
-            </w:r>
-          </w:p>
-        </w:tc>
-        <w:tc>
-          <w:tcPr>
-            <w:tcW w:type="dxa" w:w="4320"/>
-          </w:tcPr>
-          <w:p>
-            <w:pPr>
-              <w:jc w:val="center"/>
-            </w:pPr>
-            <w:r/>
-            <w:r>
-              <w:rPr>
-                <w:b w:val="0"/>
-              </w:rPr>
-              <w:t>No improvement. It varies the recordings already available and cannot add new operating points.</w:t>
-            </w:r>
-          </w:p>
-        </w:tc>
-      </w:tr>
-      <w:tr>
-        <w:tc>
-          <w:tcPr>
-            <w:tcW w:type="dxa" w:w="4320"/>
-          </w:tcPr>
-          <w:p>
-            <w:r/>
-            <w:r>
-              <w:rPr>
-                <w:b w:val="0"/>
-              </w:rPr>
               <w:t>Larger spectrograms (128x128)</w:t>
             </w:r>
           </w:p>
@@ -2867,7 +2846,7 @@
           <w:b w:val="0"/>
           <w:i w:val="0"/>
         </w:rPr>
-        <w:t>Together these show the limit is the amount of data, not the training recipe: five different changes to the model or optimisation left the result unchanged, while adding recordings (pooling) moved it by 10 points.</w:t>
+        <w:t>Together these show the limit is the amount of data, not the training recipe: several different changes to the model or optimisation left the result unchanged, while adding recordings (pooling) moved it by 10 points.</w:t>
       </w:r>
     </w:p>
     <w:p>

</xml_diff>